<commit_message>
Audit fixes: diagrams match the code, Windows scripts, report and Word version
- Sequence diagram redrawn in six parts with continuous message numbers; every
  message now exists on its receiver (ArrivalSchedule, Table, GameResult.isVictory),
  turn 10 shows Ben's payment, guards and fragment labels are readable
- Class diagram: overrides of abstract operations, two-way associations,
  ComboMeal-Dish 0..*, hidden multiplicities, Theme and GameEvent.Kind
- run.bat / test.bat compile with -sourcepath and relative paths, so they work
  when the folder path contains spaces; README build command works at every tag
- Report: complete Stage 2-3 change table, corrected design claims, layout fixes;
  Word version keeps full-size diagrams and a filled contents list
- TEST_NOTES lists all 12 Stage 1 strategies; video script corrections
- Submission zip also carries stage-1..3 snapshots exactly as tagged

No change to src, test or scripts: git diff stage-3 HEAD -- src test scripts is empty.
</commit_message>
<xml_diff>
--- a/docs/report/Restaurant-Rush-Report.docx
+++ b/docs/report/Restaurant-Rush-Report.docx
@@ -193,12 +193,14 @@
               <w:pStyle w:val="Compact"/>
               <w:spacing w:after="20" w:before="20"/>
             </w:pPr>
-            <w:r>
-              <w:rPr>
-                <w:sz w:val="18"/>
-              </w:rPr>
-              <w:t xml:space="preserve">https://github.com/theApolloAlien/restaurant-rush</w:t>
-            </w:r>
+            <w:hyperlink r:id="rId9">
+              <w:r>
+                <w:rPr>
+                  <w:rStyle w:val="Hyperlink"/>
+                </w:rPr>
+                <w:t xml:space="preserve">https://github.com/theApolloAlien/restaurant-rush</w:t>
+              </w:r>
+            </w:hyperlink>
           </w:p>
         </w:tc>
       </w:tr>
@@ -356,7 +358,7 @@
         </w:tc>
       </w:tr>
     </w:tbl>
-    <w:bookmarkStart w:id="13" w:name="overview"/>
+    <w:bookmarkStart w:id="14" w:name="overview"/>
     <w:p>
       <w:pPr>
         <w:pStyle w:val="Heading1"/>
@@ -376,7 +378,39 @@
         <w:fldChar w:fldCharType="separate"/>
       </w:r>
       <w:r>
-        <w:t>Right-click and choose Update Field to show the contents.</w:t>
+        <w:t>1 Overview</w:t>
+        <w:br/>
+      </w:r>
+      <w:r>
+        <w:t>2 UML class diagram (final design, Stage 3)</w:t>
+        <w:br/>
+      </w:r>
+      <w:r>
+        <w:t>3 UML sequence diagram</w:t>
+        <w:br/>
+      </w:r>
+      <w:r>
+        <w:t>4 Design discussion</w:t>
+        <w:br/>
+      </w:r>
+      <w:r>
+        <w:t>5 How the player's choices change the result</w:t>
+        <w:br/>
+      </w:r>
+      <w:r>
+        <w:t>6 Development process and stage comparisons</w:t>
+        <w:br/>
+      </w:r>
+      <w:r>
+        <w:t>7 Functional evidence</w:t>
+        <w:br/>
+      </w:r>
+      <w:r>
+        <w:t>8 Rule interpretations</w:t>
+        <w:br/>
+      </w:r>
+      <w:r>
+        <w:t>9 Reflection and contributions</w:t>
       </w:r>
       <w:r>
         <w:fldChar w:fldCharType="end"/>
@@ -410,7 +444,7 @@
         <w:t xml:space="preserve">never enough staff time, so every turn comes down to the same question: who do we look after first?</w:t>
       </w:r>
     </w:p>
-    <w:bookmarkStart w:id="9" w:name="base-setting"/>
+    <w:bookmarkStart w:id="10" w:name="base-setting"/>
     <w:p>
       <w:pPr>
         <w:pStyle w:val="Heading3"/>
@@ -440,7 +474,7 @@
         </w:numPr>
       </w:pPr>
       <w:r>
-        <w:t xml:space="preserve">Waiter, Chef and Cashier, one task each per turn</w:t>
+        <w:t xml:space="preserve">Waiter, Chef and Cashier, one task each per turn (Stage 3 adds a Host)</w:t>
       </w:r>
     </w:p>
     <w:p>
@@ -479,8 +513,8 @@
         <w:t xml:space="preserve">Win: at least 4 paid, $45 revenue and an average satisfaction of 60</w:t>
       </w:r>
     </w:p>
-    <w:bookmarkEnd w:id="9"/>
-    <w:bookmarkStart w:id="10" w:name="running-it"/>
+    <w:bookmarkEnd w:id="10"/>
+    <w:bookmarkStart w:id="11" w:name="running-it"/>
     <w:p>
       <w:pPr>
         <w:pStyle w:val="Heading3"/>
@@ -661,8 +695,8 @@
         <w:t xml:space="preserve">always recompile. Only a JDK is needed, with no build tool and no network access.</w:t>
       </w:r>
     </w:p>
-    <w:bookmarkEnd w:id="10"/>
-    <w:bookmarkStart w:id="11" w:name="what-happens-in-one-turn"/>
+    <w:bookmarkEnd w:id="11"/>
+    <w:bookmarkStart w:id="12" w:name="what-happens-in-one-turn"/>
     <w:p>
       <w:pPr>
         <w:pStyle w:val="Heading2"/>
@@ -1309,8 +1343,8 @@
         </w:tc>
       </w:tr>
     </w:tbl>
-    <w:bookmarkEnd w:id="11"/>
-    <w:bookmarkStart w:id="12" w:name="the-three-stages"/>
+    <w:bookmarkEnd w:id="12"/>
+    <w:bookmarkStart w:id="13" w:name="the-three-stages"/>
     <w:p>
       <w:pPr>
         <w:pStyle w:val="Heading2"/>
@@ -1661,13 +1695,13 @@
         </w:tc>
       </w:tr>
     </w:tbl>
-    <w:bookmarkEnd w:id="12"/>
     <w:bookmarkEnd w:id="13"/>
-    <w:bookmarkStart w:id="17" w:name="uml-class-diagram-final-design-stage-3"/>
+    <w:bookmarkEnd w:id="14"/>
+    <w:bookmarkStart w:id="18" w:name="uml-class-diagram-final-design-stage-3"/>
     <w:p>
       <w:pPr>
         <w:sectPr>
-          <w:footerReference w:type="default" r:id="rId9"/>
+          <w:footerReference w:type="default" r:id="rId10"/>
           <w:footnotePr>
             <w:numRestart w:val="eachSect"/>
           </w:footnotePr>
@@ -1711,16 +1745,19 @@
         <w:t xml:space="preserve">toString()</w:t>
       </w:r>
       <w:r>
-        <w:t xml:space="preserve"> </w:t>
-      </w:r>
-      <w:r>
-        <w:t xml:space="preserve">and private</w:t>
-      </w:r>
-      <w:r>
-        <w:t xml:space="preserve"> </w:t>
-      </w:r>
-      <w:r>
-        <w:t xml:space="preserve">helpers are left out. Editable version:</w:t>
+        <w:t xml:space="preserve">, most</w:t>
+      </w:r>
+      <w:r>
+        <w:t xml:space="preserve"> </w:t>
+      </w:r>
+      <w:r>
+        <w:t xml:space="preserve">constructors and most private helpers are left out, and «record» components are shown as read-only properties.</w:t>
+      </w:r>
+      <w:r>
+        <w:t xml:space="preserve"> </w:t>
+      </w:r>
+      <w:r>
+        <w:t xml:space="preserve">Editable version:</w:t>
       </w:r>
       <w:r>
         <w:t xml:space="preserve"> </w:t>
@@ -1739,7 +1776,7 @@
       <w:pPr>
         <w:pStyle w:val="BodyText"/>
         <w:sectPr>
-          <w:footerReference w:type="default" r:id="rId10"/>
+          <w:footerReference w:type="default" r:id="rId11"/>
           <w:footnotePr>
             <w:numRestart w:val="eachSect"/>
           </w:footnotePr>
@@ -1750,20 +1787,20 @@
       <w:r>
         <w:drawing>
           <wp:inline>
-            <wp:extent cx="5334000" cy="4576500"/>
+            <wp:extent cx="10070088" cy="8639999"/>
             <wp:effectExtent b="0" l="0" r="0" t="0"/>
-            <wp:docPr descr="WIDE:Class diagram" title="" id="15" name="Picture"/>
+            <wp:docPr descr="Class diagram" title="Class diagram" id="16" name="Picture"/>
             <a:graphic>
               <a:graphicData uri="http://schemas.openxmlformats.org/drawingml/2006/picture">
                 <pic:pic>
                   <pic:nvPicPr>
-                    <pic:cNvPr descr="img/CLASS_DIAGRAM.png" id="16" name="Picture"/>
+                    <pic:cNvPr descr="img/CLASS_DIAGRAM.png" id="17" name="Picture"/>
                     <pic:cNvPicPr>
                       <a:picLocks noChangeArrowheads="1" noChangeAspect="1"/>
                     </pic:cNvPicPr>
                   </pic:nvPicPr>
                   <pic:blipFill>
-                    <a:blip r:embed="rId14"/>
+                    <a:blip r:embed="rId15"/>
                     <a:stretch>
                       <a:fillRect/>
                     </a:stretch>
@@ -1771,7 +1808,7 @@
                   <pic:spPr bwMode="auto">
                     <a:xfrm>
                       <a:off x="0" y="0"/>
-                      <a:ext cx="5334000" cy="4576500"/>
+                      <a:ext cx="10070088" cy="8639999"/>
                     </a:xfrm>
                     <a:prstGeom prst="rect">
                       <a:avLst/>
@@ -1790,8 +1827,8 @@
         </w:drawing>
       </w:r>
     </w:p>
-    <w:bookmarkEnd w:id="17"/>
-    <w:bookmarkStart w:id="22" w:name="reading-the-class-diagram"/>
+    <w:bookmarkEnd w:id="18"/>
+    <w:bookmarkStart w:id="23" w:name="reading-the-class-diagram"/>
     <w:p>
       <w:pPr>
         <w:pStyle w:val="Heading2"/>
@@ -1800,7 +1837,7 @@
         <w:t xml:space="preserve">2.1 Reading the class diagram</w:t>
       </w:r>
     </w:p>
-    <w:bookmarkStart w:id="18" w:name="encapsulation"/>
+    <w:bookmarkStart w:id="19" w:name="encapsulation"/>
     <w:p>
       <w:pPr>
         <w:pStyle w:val="Heading3"/>
@@ -1850,26 +1887,194 @@
         <w:t xml:space="preserve"> </w:t>
       </w:r>
       <w:r>
-        <w:t xml:space="preserve">the door. The methods that change a table or a customer's status are package-private (</w:t>
+        <w:t xml:space="preserve">the door:</w:t>
+      </w:r>
+      <w:r>
+        <w:t xml:space="preserve"> </w:t>
       </w:r>
       <w:r>
         <w:rPr>
           <w:rStyle w:val="VerbatimChar"/>
         </w:rPr>
+        <w:t xml:space="preserve">Customer.seatAt</w:t>
+      </w:r>
+      <w:r>
+        <w:t xml:space="preserve">,</w:t>
+      </w:r>
+      <w:r>
+        <w:t xml:space="preserve"> </w:t>
+      </w:r>
+      <w:r>
+        <w:rPr>
+          <w:rStyle w:val="VerbatimChar"/>
+        </w:rPr>
+        <w:t xml:space="preserve">placeOrder</w:t>
+      </w:r>
+      <w:r>
+        <w:t xml:space="preserve">,</w:t>
+      </w:r>
+      <w:r>
+        <w:t xml:space="preserve"> </w:t>
+      </w:r>
+      <w:r>
+        <w:rPr>
+          <w:rStyle w:val="VerbatimChar"/>
+        </w:rPr>
+        <w:t xml:space="preserve">startEating</w:t>
+      </w:r>
+      <w:r>
+        <w:t xml:space="preserve">,</w:t>
+      </w:r>
+      <w:r>
+        <w:t xml:space="preserve"> </w:t>
+      </w:r>
+      <w:r>
+        <w:rPr>
+          <w:rStyle w:val="VerbatimChar"/>
+        </w:rPr>
+        <w:t xml:space="preserve">pay</w:t>
+      </w:r>
+      <w:r>
+        <w:t xml:space="preserve"> </w:t>
+      </w:r>
+      <w:r>
+        <w:t xml:space="preserve">and</w:t>
+      </w:r>
+      <w:r>
+        <w:t xml:space="preserve"> </w:t>
+      </w:r>
+      <w:r>
+        <w:rPr>
+          <w:rStyle w:val="VerbatimChar"/>
+        </w:rPr>
+        <w:t xml:space="preserve">leave</w:t>
+      </w:r>
+      <w:r>
+        <w:t xml:space="preserve">, and</w:t>
+      </w:r>
+      <w:r>
+        <w:t xml:space="preserve"> </w:t>
+      </w:r>
+      <w:r>
+        <w:rPr>
+          <w:rStyle w:val="VerbatimChar"/>
+        </w:rPr>
+        <w:t xml:space="preserve">Table.assign</w:t>
+      </w:r>
+      <w:r>
+        <w:t xml:space="preserve"> </w:t>
+      </w:r>
+      <w:r>
+        <w:t xml:space="preserve">and</w:t>
+      </w:r>
+      <w:r>
+        <w:t xml:space="preserve"> </w:t>
+      </w:r>
+      <w:r>
+        <w:rPr>
+          <w:rStyle w:val="VerbatimChar"/>
+        </w:rPr>
+        <w:t xml:space="preserve">release</w:t>
+      </w:r>
+      <w:r>
+        <w:t xml:space="preserve">, are package-private (</w:t>
+      </w:r>
+      <w:r>
+        <w:rPr>
+          <w:rStyle w:val="VerbatimChar"/>
+        </w:rPr>
         <w:t xml:space="preserve">~</w:t>
       </w:r>
       <w:r>
-        <w:t xml:space="preserve">), and</w:t>
-      </w:r>
-      <w:r>
-        <w:t xml:space="preserve"> </w:t>
-      </w:r>
-      <w:r>
-        <w:t xml:space="preserve">every list is handed out read-only, so the UI cannot put the game into an impossible state.</w:t>
-      </w:r>
-    </w:p>
-    <w:bookmarkEnd w:id="18"/>
-    <w:bookmarkStart w:id="19" w:name="polymorphism"/>
+        <w:t xml:space="preserve">).</w:t>
+      </w:r>
+      <w:r>
+        <w:t xml:space="preserve"> </w:t>
+      </w:r>
+      <w:r>
+        <w:t xml:space="preserve">The few public methods that change state (</w:t>
+      </w:r>
+      <w:r>
+        <w:rPr>
+          <w:rStyle w:val="VerbatimChar"/>
+        </w:rPr>
+        <w:t xml:space="preserve">finishEating</w:t>
+      </w:r>
+      <w:r>
+        <w:t xml:space="preserve">,</w:t>
+      </w:r>
+      <w:r>
+        <w:t xml:space="preserve"> </w:t>
+      </w:r>
+      <w:r>
+        <w:rPr>
+          <w:rStyle w:val="VerbatimChar"/>
+        </w:rPr>
+        <w:t xml:space="preserve">loseSatisfaction</w:t>
+      </w:r>
+      <w:r>
+        <w:t xml:space="preserve">,</w:t>
+      </w:r>
+      <w:r>
+        <w:t xml:space="preserve"> </w:t>
+      </w:r>
+      <w:r>
+        <w:rPr>
+          <w:rStyle w:val="VerbatimChar"/>
+        </w:rPr>
+        <w:t xml:space="preserve">recover</w:t>
+      </w:r>
+      <w:r>
+        <w:t xml:space="preserve">,</w:t>
+      </w:r>
+      <w:r>
+        <w:t xml:space="preserve"> </w:t>
+      </w:r>
+      <w:r>
+        <w:rPr>
+          <w:rStyle w:val="VerbatimChar"/>
+        </w:rPr>
+        <w:t xml:space="preserve">Order.prepareUnit</w:t>
+      </w:r>
+      <w:r>
+        <w:t xml:space="preserve"> </w:t>
+      </w:r>
+      <w:r>
+        <w:t xml:space="preserve">and</w:t>
+      </w:r>
+      <w:r>
+        <w:t xml:space="preserve"> </w:t>
+      </w:r>
+      <w:r>
+        <w:rPr>
+          <w:rStyle w:val="VerbatimChar"/>
+        </w:rPr>
+        <w:t xml:space="preserve">serve</w:t>
+      </w:r>
+      <w:r>
+        <w:t xml:space="preserve">) check the current status first.</w:t>
+      </w:r>
+      <w:r>
+        <w:t xml:space="preserve"> </w:t>
+      </w:r>
+      <w:r>
+        <w:t xml:space="preserve">Every list is handed out read-only, and the UI only gives commands to</w:t>
+      </w:r>
+      <w:r>
+        <w:t xml:space="preserve"> </w:t>
+      </w:r>
+      <w:r>
+        <w:rPr>
+          <w:rStyle w:val="VerbatimChar"/>
+        </w:rPr>
+        <w:t xml:space="preserve">Game</w:t>
+      </w:r>
+      <w:r>
+        <w:t xml:space="preserve">.</w:t>
+      </w:r>
+    </w:p>
+    <w:bookmarkEnd w:id="19"/>
+    <w:bookmarkStart w:id="20" w:name="polymorphism"/>
     <w:p>
       <w:pPr>
         <w:pStyle w:val="Heading3"/>
@@ -1916,6 +2121,18 @@
         <w:t xml:space="preserve">chooseFrom(Menu)</w:t>
       </w:r>
       <w:r>
+        <w:t xml:space="preserve">,</w:t>
+      </w:r>
+      <w:r>
+        <w:t xml:space="preserve"> </w:t>
+      </w:r>
+      <w:r>
+        <w:rPr>
+          <w:rStyle w:val="VerbatimChar"/>
+        </w:rPr>
+        <w:t xml:space="preserve">billFor(Money)</w:t>
+      </w:r>
+      <w:r>
         <w:t xml:space="preserve"> </w:t>
       </w:r>
       <w:r>
@@ -1928,7 +2145,307 @@
         <w:rPr>
           <w:rStyle w:val="VerbatimChar"/>
         </w:rPr>
-        <w:t xml:space="preserve">billFor(Money)</w:t>
+        <w:t xml:space="preserve">remarkOnPaying()</w:t>
+      </w:r>
+      <w:r>
+        <w:t xml:space="preserve">, plus the</w:t>
+      </w:r>
+      <w:r>
+        <w:t xml:space="preserve"> </w:t>
+      </w:r>
+      <w:r>
+        <w:rPr>
+          <w:rStyle w:val="VerbatimChar"/>
+        </w:rPr>
+        <w:t xml:space="preserve">type()</w:t>
+      </w:r>
+      <w:r>
+        <w:t xml:space="preserve"> </w:t>
+      </w:r>
+      <w:r>
+        <w:t xml:space="preserve">label, and</w:t>
+      </w:r>
+      <w:r>
+        <w:t xml:space="preserve"> </w:t>
+      </w:r>
+      <w:r>
+        <w:rPr>
+          <w:rStyle w:val="VerbatimChar"/>
+        </w:rPr>
+        <w:t xml:space="preserve">Game</w:t>
+      </w:r>
+      <w:r>
+        <w:t xml:space="preserve">,</w:t>
+      </w:r>
+      <w:r>
+        <w:t xml:space="preserve"> </w:t>
+      </w:r>
+      <w:r>
+        <w:rPr>
+          <w:rStyle w:val="VerbatimChar"/>
+        </w:rPr>
+        <w:t xml:space="preserve">Waiter</w:t>
+      </w:r>
+      <w:r>
+        <w:t xml:space="preserve"> </w:t>
+      </w:r>
+      <w:r>
+        <w:t xml:space="preserve">and</w:t>
+      </w:r>
+      <w:r>
+        <w:t xml:space="preserve"> </w:t>
+      </w:r>
+      <w:r>
+        <w:rPr>
+          <w:rStyle w:val="VerbatimChar"/>
+        </w:rPr>
+        <w:t xml:space="preserve">Cashier</w:t>
+      </w:r>
+      <w:r>
+        <w:t xml:space="preserve"> </w:t>
+      </w:r>
+      <w:r>
+        <w:t xml:space="preserve">never check a customer's type. In the same way,</w:t>
+      </w:r>
+      <w:r>
+        <w:t xml:space="preserve"> </w:t>
+      </w:r>
+      <w:r>
+        <w:rPr>
+          <w:rStyle w:val="VerbatimChar"/>
+        </w:rPr>
+        <w:t xml:space="preserve">Dish</w:t>
+      </w:r>
+      <w:r>
+        <w:t xml:space="preserve"> </w:t>
+      </w:r>
+      <w:r>
+        <w:t xml:space="preserve">and</w:t>
+      </w:r>
+      <w:r>
+        <w:t xml:space="preserve"> </w:t>
+      </w:r>
+      <w:r>
+        <w:rPr>
+          <w:rStyle w:val="VerbatimChar"/>
+        </w:rPr>
+        <w:t xml:space="preserve">ComboMeal</w:t>
+      </w:r>
+      <w:r>
+        <w:t xml:space="preserve"> </w:t>
+      </w:r>
+      <w:r>
+        <w:t xml:space="preserve">answer</w:t>
+      </w:r>
+      <w:r>
+        <w:t xml:space="preserve"> </w:t>
+      </w:r>
+      <w:r>
+        <w:rPr>
+          <w:rStyle w:val="VerbatimChar"/>
+        </w:rPr>
+        <w:t xml:space="preserve">price()</w:t>
+      </w:r>
+      <w:r>
+        <w:t xml:space="preserve"> </w:t>
+      </w:r>
+      <w:r>
+        <w:t xml:space="preserve">and</w:t>
+      </w:r>
+      <w:r>
+        <w:t xml:space="preserve"> </w:t>
+      </w:r>
+      <w:r>
+        <w:rPr>
+          <w:rStyle w:val="VerbatimChar"/>
+        </w:rPr>
+        <w:t xml:space="preserve">prepUnits()</w:t>
+      </w:r>
+      <w:r>
+        <w:t xml:space="preserve"> </w:t>
+      </w:r>
+      <w:r>
+        <w:t xml:space="preserve">differently,</w:t>
+      </w:r>
+      <w:r>
+        <w:t xml:space="preserve"> </w:t>
+      </w:r>
+      <w:r>
+        <w:t xml:space="preserve">while</w:t>
+      </w:r>
+      <w:r>
+        <w:t xml:space="preserve"> </w:t>
+      </w:r>
+      <w:r>
+        <w:rPr>
+          <w:rStyle w:val="VerbatimChar"/>
+        </w:rPr>
+        <w:t xml:space="preserve">Order</w:t>
+      </w:r>
+      <w:r>
+        <w:t xml:space="preserve"> </w:t>
+      </w:r>
+      <w:r>
+        <w:t xml:space="preserve">and</w:t>
+      </w:r>
+      <w:r>
+        <w:t xml:space="preserve"> </w:t>
+      </w:r>
+      <w:r>
+        <w:rPr>
+          <w:rStyle w:val="VerbatimChar"/>
+        </w:rPr>
+        <w:t xml:space="preserve">Chef</w:t>
+      </w:r>
+      <w:r>
+        <w:t xml:space="preserve"> </w:t>
+      </w:r>
+      <w:r>
+        <w:t xml:space="preserve">treat them the same.</w:t>
+      </w:r>
+    </w:p>
+    <w:bookmarkEnd w:id="20"/>
+    <w:bookmarkStart w:id="21" w:name="composition-and-aggregation"/>
+    <w:p>
+      <w:pPr>
+        <w:pStyle w:val="Heading3"/>
+      </w:pPr>
+      <w:r>
+        <w:t xml:space="preserve">Composition and aggregation</w:t>
+      </w:r>
+    </w:p>
+    <w:p>
+      <w:pPr>
+        <w:pStyle w:val="FirstParagraph"/>
+      </w:pPr>
+      <w:r>
+        <w:rPr>
+          <w:rStyle w:val="VerbatimChar"/>
+        </w:rPr>
+        <w:t xml:space="preserve">Game</w:t>
+      </w:r>
+      <w:r>
+        <w:t xml:space="preserve"> </w:t>
+      </w:r>
+      <w:r>
+        <w:t xml:space="preserve">owns its restaurant, staff, Happy Hour and pricing policy, which exist only for one game.</w:t>
+      </w:r>
+      <w:r>
+        <w:t xml:space="preserve"> </w:t>
+      </w:r>
+      <w:r>
+        <w:rPr>
+          <w:rStyle w:val="VerbatimChar"/>
+        </w:rPr>
+        <w:t xml:space="preserve">Restaurant</w:t>
+      </w:r>
+      <w:r>
+        <w:t xml:space="preserve"> </w:t>
+      </w:r>
+      <w:r>
+        <w:t xml:space="preserve">owns its two tables and its orders. Customers arrive from outside, so</w:t>
+      </w:r>
+      <w:r>
+        <w:t xml:space="preserve"> </w:t>
+      </w:r>
+      <w:r>
+        <w:rPr>
+          <w:rStyle w:val="VerbatimChar"/>
+        </w:rPr>
+        <w:t xml:space="preserve">Restaurant</w:t>
+      </w:r>
+      <w:r>
+        <w:t xml:space="preserve"> </w:t>
+      </w:r>
+      <w:r>
+        <w:t xml:space="preserve">only aggregates them. A</w:t>
+      </w:r>
+      <w:r>
+        <w:t xml:space="preserve"> </w:t>
+      </w:r>
+      <w:r>
+        <w:rPr>
+          <w:rStyle w:val="VerbatimChar"/>
+        </w:rPr>
+        <w:t xml:space="preserve">ComboMeal</w:t>
+      </w:r>
+      <w:r>
+        <w:t xml:space="preserve"> </w:t>
+      </w:r>
+      <w:r>
+        <w:t xml:space="preserve">aggregates two</w:t>
+      </w:r>
+      <w:r>
+        <w:t xml:space="preserve"> </w:t>
+      </w:r>
+      <w:r>
+        <w:rPr>
+          <w:rStyle w:val="VerbatimChar"/>
+        </w:rPr>
+        <w:t xml:space="preserve">Dish</w:t>
+      </w:r>
+      <w:r>
+        <w:t xml:space="preserve"> </w:t>
+      </w:r>
+      <w:r>
+        <w:t xml:space="preserve">objects</w:t>
+      </w:r>
+      <w:r>
+        <w:t xml:space="preserve"> </w:t>
+      </w:r>
+      <w:r>
+        <w:t xml:space="preserve">that are also on the menu by themselves.</w:t>
+      </w:r>
+    </w:p>
+    <w:bookmarkEnd w:id="21"/>
+    <w:bookmarkStart w:id="22" w:name="inheritance"/>
+    <w:p>
+      <w:pPr>
+        <w:pStyle w:val="Heading3"/>
+      </w:pPr>
+      <w:r>
+        <w:t xml:space="preserve">Inheritance</w:t>
+      </w:r>
+    </w:p>
+    <w:p>
+      <w:pPr>
+        <w:pStyle w:val="FirstParagraph"/>
+      </w:pPr>
+      <w:r>
+        <w:rPr>
+          <w:rStyle w:val="VerbatimChar"/>
+        </w:rPr>
+        <w:t xml:space="preserve">StaffMember</w:t>
+      </w:r>
+      <w:r>
+        <w:t xml:space="preserve"> </w:t>
+      </w:r>
+      <w:r>
+        <w:t xml:space="preserve">holds the per-turn task budget.</w:t>
+      </w:r>
+      <w:r>
+        <w:t xml:space="preserve"> </w:t>
+      </w:r>
+      <w:r>
+        <w:rPr>
+          <w:rStyle w:val="VerbatimChar"/>
+        </w:rPr>
+        <w:t xml:space="preserve">DirectedStaff</w:t>
+      </w:r>
+      <w:r>
+        <w:t xml:space="preserve"> </w:t>
+      </w:r>
+      <w:r>
+        <w:t xml:space="preserve">adds the template method</w:t>
+      </w:r>
+      <w:r>
+        <w:t xml:space="preserve"> </w:t>
+      </w:r>
+      <w:r>
+        <w:rPr>
+          <w:rStyle w:val="VerbatimChar"/>
+        </w:rPr>
+        <w:t xml:space="preserve">perform()</w:t>
       </w:r>
       <w:r>
         <w:t xml:space="preserve">, and</w:t>
@@ -1940,7 +2457,7 @@
         <w:rPr>
           <w:rStyle w:val="VerbatimChar"/>
         </w:rPr>
-        <w:t xml:space="preserve">Game</w:t>
+        <w:t xml:space="preserve">Waiter</w:t>
       </w:r>
       <w:r>
         <w:t xml:space="preserve">,</w:t>
@@ -1952,7 +2469,7 @@
         <w:rPr>
           <w:rStyle w:val="VerbatimChar"/>
         </w:rPr>
-        <w:t xml:space="preserve">Waiter</w:t>
+        <w:t xml:space="preserve">Chef</w:t>
       </w:r>
       <w:r>
         <w:t xml:space="preserve"> </w:t>
@@ -1967,13 +2484,13 @@
         <w:rPr>
           <w:rStyle w:val="VerbatimChar"/>
         </w:rPr>
-        <w:t xml:space="preserve">Cashier</w:t>
-      </w:r>
-      <w:r>
-        <w:t xml:space="preserve"> </w:t>
-      </w:r>
-      <w:r>
-        <w:t xml:space="preserve">never check a customer's type. In the same way,</w:t>
+        <w:t xml:space="preserve">Host</w:t>
+      </w:r>
+      <w:r>
+        <w:t xml:space="preserve"> </w:t>
+      </w:r>
+      <w:r>
+        <w:t xml:space="preserve">fill in</w:t>
       </w:r>
       <w:r>
         <w:t xml:space="preserve"> </w:t>
@@ -1982,7 +2499,7 @@
         <w:rPr>
           <w:rStyle w:val="VerbatimChar"/>
         </w:rPr>
-        <w:t xml:space="preserve">Dish</w:t>
+        <w:t xml:space="preserve">duties()</w:t>
       </w:r>
       <w:r>
         <w:t xml:space="preserve"> </w:t>
@@ -1997,13 +2514,10 @@
         <w:rPr>
           <w:rStyle w:val="VerbatimChar"/>
         </w:rPr>
-        <w:t xml:space="preserve">ComboMeal</w:t>
-      </w:r>
-      <w:r>
-        <w:t xml:space="preserve"> </w:t>
-      </w:r>
-      <w:r>
-        <w:t xml:space="preserve">answer</w:t>
+        <w:t xml:space="preserve">carryOut()</w:t>
+      </w:r>
+      <w:r>
+        <w:t xml:space="preserve">. The Cashier takes no instructions, so it extends</w:t>
       </w:r>
       <w:r>
         <w:t xml:space="preserve"> </w:t>
@@ -2012,13 +2526,13 @@
         <w:rPr>
           <w:rStyle w:val="VerbatimChar"/>
         </w:rPr>
-        <w:t xml:space="preserve">price()</w:t>
-      </w:r>
-      <w:r>
-        <w:t xml:space="preserve"> </w:t>
-      </w:r>
-      <w:r>
-        <w:t xml:space="preserve">and</w:t>
+        <w:t xml:space="preserve">StaffMember</w:t>
+      </w:r>
+      <w:r>
+        <w:t xml:space="preserve"> </w:t>
+      </w:r>
+      <w:r>
+        <w:t xml:space="preserve">directly.</w:t>
       </w:r>
       <w:r>
         <w:t xml:space="preserve"> </w:t>
@@ -2027,19 +2541,13 @@
         <w:rPr>
           <w:rStyle w:val="VerbatimChar"/>
         </w:rPr>
-        <w:t xml:space="preserve">prepUnits()</w:t>
-      </w:r>
-      <w:r>
-        <w:t xml:space="preserve"> </w:t>
-      </w:r>
-      <w:r>
-        <w:t xml:space="preserve">differently,</w:t>
-      </w:r>
-      <w:r>
-        <w:t xml:space="preserve"> </w:t>
-      </w:r>
-      <w:r>
-        <w:t xml:space="preserve">while</w:t>
+        <w:t xml:space="preserve">HappyHour</w:t>
+      </w:r>
+      <w:r>
+        <w:t xml:space="preserve"> </w:t>
+      </w:r>
+      <w:r>
+        <w:t xml:space="preserve">implements the</w:t>
       </w:r>
       <w:r>
         <w:t xml:space="preserve"> </w:t>
@@ -2048,55 +2556,109 @@
         <w:rPr>
           <w:rStyle w:val="VerbatimChar"/>
         </w:rPr>
-        <w:t xml:space="preserve">Order</w:t>
-      </w:r>
-      <w:r>
-        <w:t xml:space="preserve"> </w:t>
-      </w:r>
-      <w:r>
-        <w:t xml:space="preserve">and</w:t>
-      </w:r>
-      <w:r>
-        <w:t xml:space="preserve"> </w:t>
+        <w:t xml:space="preserve">PriceModifier</w:t>
+      </w:r>
+      <w:r>
+        <w:t xml:space="preserve"> </w:t>
+      </w:r>
+      <w:r>
+        <w:t xml:space="preserve">interface.</w:t>
+      </w:r>
+    </w:p>
+    <w:bookmarkEnd w:id="22"/>
+    <w:p>
+      <w:pPr>
+        <w:pStyle w:val="BodyText"/>
+      </w:pPr>
+      <w:r>
+        <w:t xml:space="preserve">The packages form layers, and dependencies only point one way:</w:t>
+      </w:r>
+      <w:r>
+        <w:t xml:space="preserve"> </w:t>
+      </w:r>
+      <w:r>
+        <w:t xml:space="preserve">ui</w:t>
+      </w:r>
+      <w:r>
+        <w:t xml:space="preserve"> </w:t>
+      </w:r>
+      <w:r>
+        <w:t xml:space="preserve">reads input and draws the screen,</w:t>
+      </w:r>
+      <w:r>
+        <w:t xml:space="preserve"> </w:t>
+      </w:r>
+      <w:r>
+        <w:t xml:space="preserve">control</w:t>
+      </w:r>
+      <w:r>
+        <w:t xml:space="preserve"> </w:t>
+      </w:r>
+      <w:r>
+        <w:t xml:space="preserve">runs the turn sequence,</w:t>
+      </w:r>
+      <w:r>
+        <w:t xml:space="preserve"> </w:t>
+      </w:r>
+      <w:r>
+        <w:t xml:space="preserve">staff</w:t>
+      </w:r>
+      <w:r>
+        <w:t xml:space="preserve"> </w:t>
+      </w:r>
+      <w:r>
+        <w:t xml:space="preserve">decides what each role may do,</w:t>
+      </w:r>
+      <w:r>
+        <w:t xml:space="preserve"> </w:t>
+      </w:r>
+      <w:r>
+        <w:t xml:space="preserve">policy</w:t>
+      </w:r>
+      <w:r>
+        <w:t xml:space="preserve"> </w:t>
+      </w:r>
+      <w:r>
+        <w:t xml:space="preserve">holds the pricing rules, and</w:t>
+      </w:r>
+      <w:r>
+        <w:t xml:space="preserve"> </w:t>
+      </w:r>
+      <w:r>
+        <w:t xml:space="preserve">model</w:t>
+      </w:r>
+      <w:r>
+        <w:t xml:space="preserve"> </w:t>
+      </w:r>
+      <w:r>
+        <w:t xml:space="preserve">holds the entities and their rules.</w:t>
+      </w:r>
+      <w:r>
+        <w:t xml:space="preserve"> </w:t>
+      </w:r>
+      <w:r>
+        <w:t xml:space="preserve">The small records (</w:t>
       </w:r>
       <w:r>
         <w:rPr>
           <w:rStyle w:val="VerbatimChar"/>
         </w:rPr>
-        <w:t xml:space="preserve">Chef</w:t>
-      </w:r>
-      <w:r>
-        <w:t xml:space="preserve"> </w:t>
-      </w:r>
-      <w:r>
-        <w:t xml:space="preserve">treat them the same.</w:t>
-      </w:r>
-    </w:p>
-    <w:bookmarkEnd w:id="19"/>
-    <w:bookmarkStart w:id="20" w:name="composition-and-aggregation"/>
-    <w:p>
-      <w:pPr>
-        <w:pStyle w:val="Heading3"/>
-      </w:pPr>
-      <w:r>
-        <w:t xml:space="preserve">Composition and aggregation</w:t>
-      </w:r>
-    </w:p>
-    <w:p>
-      <w:pPr>
-        <w:pStyle w:val="FirstParagraph"/>
-      </w:pPr>
+        <w:t xml:space="preserve">Command</w:t>
+      </w:r>
+      <w:r>
+        <w:t xml:space="preserve">,</w:t>
+      </w:r>
+      <w:r>
+        <w:t xml:space="preserve"> </w:t>
+      </w:r>
       <w:r>
         <w:rPr>
           <w:rStyle w:val="VerbatimChar"/>
         </w:rPr>
-        <w:t xml:space="preserve">Game</w:t>
-      </w:r>
-      <w:r>
-        <w:t xml:space="preserve"> </w:t>
-      </w:r>
-      <w:r>
-        <w:t xml:space="preserve">owns its restaurant, staff, Happy Hour and pricing policy, which exist only for one game.</w:t>
+        <w:t xml:space="preserve">ActionResult</w:t>
+      </w:r>
+      <w:r>
+        <w:t xml:space="preserve">,</w:t>
       </w:r>
       <w:r>
         <w:t xml:space="preserve"> </w:t>
@@ -2105,13 +2667,10 @@
         <w:rPr>
           <w:rStyle w:val="VerbatimChar"/>
         </w:rPr>
-        <w:t xml:space="preserve">Restaurant</w:t>
-      </w:r>
-      <w:r>
-        <w:t xml:space="preserve"> </w:t>
-      </w:r>
-      <w:r>
-        <w:t xml:space="preserve">owns its two tables and its orders. Customers arrive from outside, so</w:t>
+        <w:t xml:space="preserve">TurnContext</w:t>
+      </w:r>
+      <w:r>
+        <w:t xml:space="preserve">,</w:t>
       </w:r>
       <w:r>
         <w:t xml:space="preserve"> </w:t>
@@ -2120,13 +2679,10 @@
         <w:rPr>
           <w:rStyle w:val="VerbatimChar"/>
         </w:rPr>
-        <w:t xml:space="preserve">Restaurant</w:t>
-      </w:r>
-      <w:r>
-        <w:t xml:space="preserve"> </w:t>
-      </w:r>
-      <w:r>
-        <w:t xml:space="preserve">only aggregates them. A</w:t>
+        <w:t xml:space="preserve">Objective</w:t>
+      </w:r>
+      <w:r>
+        <w:t xml:space="preserve">,</w:t>
       </w:r>
       <w:r>
         <w:t xml:space="preserve"> </w:t>
@@ -2135,13 +2691,10 @@
         <w:rPr>
           <w:rStyle w:val="VerbatimChar"/>
         </w:rPr>
-        <w:t xml:space="preserve">ComboMeal</w:t>
-      </w:r>
-      <w:r>
-        <w:t xml:space="preserve"> </w:t>
-      </w:r>
-      <w:r>
-        <w:t xml:space="preserve">aggregates two</w:t>
+        <w:t xml:space="preserve">Scoreboard</w:t>
+      </w:r>
+      <w:r>
+        <w:t xml:space="preserve">,</w:t>
       </w:r>
       <w:r>
         <w:t xml:space="preserve"> </w:t>
@@ -2150,344 +2703,26 @@
         <w:rPr>
           <w:rStyle w:val="VerbatimChar"/>
         </w:rPr>
-        <w:t xml:space="preserve">Dish</w:t>
-      </w:r>
-      <w:r>
-        <w:t xml:space="preserve"> </w:t>
-      </w:r>
-      <w:r>
-        <w:t xml:space="preserve">objects</w:t>
-      </w:r>
-      <w:r>
-        <w:t xml:space="preserve"> </w:t>
-      </w:r>
-      <w:r>
-        <w:t xml:space="preserve">that are also on the menu by themselves.</w:t>
-      </w:r>
-    </w:p>
-    <w:bookmarkEnd w:id="20"/>
-    <w:bookmarkStart w:id="21" w:name="inheritance"/>
-    <w:p>
-      <w:pPr>
-        <w:pStyle w:val="Heading3"/>
-      </w:pPr>
-      <w:r>
-        <w:t xml:space="preserve">Inheritance</w:t>
-      </w:r>
-    </w:p>
-    <w:p>
-      <w:pPr>
-        <w:pStyle w:val="FirstParagraph"/>
-      </w:pPr>
+        <w:t xml:space="preserve">GameResult</w:t>
+      </w:r>
+      <w:r>
+        <w:t xml:space="preserve">,</w:t>
+      </w:r>
+      <w:r>
+        <w:t xml:space="preserve"> </w:t>
+      </w:r>
       <w:r>
         <w:rPr>
           <w:rStyle w:val="VerbatimChar"/>
         </w:rPr>
-        <w:t xml:space="preserve">StaffMember</w:t>
-      </w:r>
-      <w:r>
-        <w:t xml:space="preserve"> </w:t>
-      </w:r>
-      <w:r>
-        <w:t xml:space="preserve">holds the per-turn task budget.</w:t>
-      </w:r>
-      <w:r>
-        <w:t xml:space="preserve"> </w:t>
-      </w:r>
-      <w:r>
-        <w:rPr>
-          <w:rStyle w:val="VerbatimChar"/>
-        </w:rPr>
-        <w:t xml:space="preserve">DirectedStaff</w:t>
-      </w:r>
-      <w:r>
-        <w:t xml:space="preserve"> </w:t>
-      </w:r>
-      <w:r>
-        <w:t xml:space="preserve">adds the template method</w:t>
-      </w:r>
-      <w:r>
-        <w:t xml:space="preserve"> </w:t>
-      </w:r>
-      <w:r>
-        <w:rPr>
-          <w:rStyle w:val="VerbatimChar"/>
-        </w:rPr>
-        <w:t xml:space="preserve">perform()</w:t>
-      </w:r>
-      <w:r>
-        <w:t xml:space="preserve">, and</w:t>
-      </w:r>
-      <w:r>
-        <w:t xml:space="preserve"> </w:t>
-      </w:r>
-      <w:r>
-        <w:rPr>
-          <w:rStyle w:val="VerbatimChar"/>
-        </w:rPr>
-        <w:t xml:space="preserve">Waiter</w:t>
-      </w:r>
-      <w:r>
-        <w:t xml:space="preserve">,</w:t>
-      </w:r>
-      <w:r>
-        <w:t xml:space="preserve"> </w:t>
-      </w:r>
-      <w:r>
-        <w:rPr>
-          <w:rStyle w:val="VerbatimChar"/>
-        </w:rPr>
-        <w:t xml:space="preserve">Chef</w:t>
-      </w:r>
-      <w:r>
-        <w:t xml:space="preserve"> </w:t>
-      </w:r>
-      <w:r>
-        <w:t xml:space="preserve">and</w:t>
-      </w:r>
-      <w:r>
-        <w:t xml:space="preserve"> </w:t>
-      </w:r>
-      <w:r>
-        <w:rPr>
-          <w:rStyle w:val="VerbatimChar"/>
-        </w:rPr>
-        <w:t xml:space="preserve">Host</w:t>
-      </w:r>
-      <w:r>
-        <w:t xml:space="preserve"> </w:t>
-      </w:r>
-      <w:r>
-        <w:t xml:space="preserve">fill in</w:t>
-      </w:r>
-      <w:r>
-        <w:t xml:space="preserve"> </w:t>
-      </w:r>
-      <w:r>
-        <w:rPr>
-          <w:rStyle w:val="VerbatimChar"/>
-        </w:rPr>
-        <w:t xml:space="preserve">duties()</w:t>
-      </w:r>
-      <w:r>
-        <w:t xml:space="preserve"> </w:t>
-      </w:r>
-      <w:r>
-        <w:t xml:space="preserve">and</w:t>
-      </w:r>
-      <w:r>
-        <w:t xml:space="preserve"> </w:t>
-      </w:r>
-      <w:r>
-        <w:rPr>
-          <w:rStyle w:val="VerbatimChar"/>
-        </w:rPr>
-        <w:t xml:space="preserve">carryOut()</w:t>
-      </w:r>
-      <w:r>
-        <w:t xml:space="preserve">. The Cashier takes no instructions, so it extends</w:t>
-      </w:r>
-      <w:r>
-        <w:t xml:space="preserve"> </w:t>
-      </w:r>
-      <w:r>
-        <w:rPr>
-          <w:rStyle w:val="VerbatimChar"/>
-        </w:rPr>
-        <w:t xml:space="preserve">StaffMember</w:t>
-      </w:r>
-      <w:r>
-        <w:t xml:space="preserve"> </w:t>
-      </w:r>
-      <w:r>
-        <w:t xml:space="preserve">directly.</w:t>
-      </w:r>
-      <w:r>
-        <w:t xml:space="preserve"> </w:t>
-      </w:r>
-      <w:r>
-        <w:rPr>
-          <w:rStyle w:val="VerbatimChar"/>
-        </w:rPr>
-        <w:t xml:space="preserve">PriceModifier</w:t>
-      </w:r>
-      <w:r>
-        <w:t xml:space="preserve"> </w:t>
-      </w:r>
-      <w:r>
-        <w:t xml:space="preserve">is the only interface, implemented by</w:t>
-      </w:r>
-      <w:r>
-        <w:t xml:space="preserve"> </w:t>
-      </w:r>
-      <w:r>
-        <w:rPr>
-          <w:rStyle w:val="VerbatimChar"/>
-        </w:rPr>
-        <w:t xml:space="preserve">HappyHour</w:t>
-      </w:r>
-      <w:r>
-        <w:t xml:space="preserve">.</w:t>
-      </w:r>
-    </w:p>
-    <w:bookmarkEnd w:id="21"/>
-    <w:p>
-      <w:pPr>
-        <w:pStyle w:val="BodyText"/>
-      </w:pPr>
-      <w:r>
-        <w:t xml:space="preserve">The packages form layers, and dependencies only point one way:</w:t>
-      </w:r>
-      <w:r>
-        <w:t xml:space="preserve"> </w:t>
-      </w:r>
-      <w:r>
-        <w:t xml:space="preserve">ui</w:t>
-      </w:r>
-      <w:r>
-        <w:t xml:space="preserve"> </w:t>
-      </w:r>
-      <w:r>
-        <w:t xml:space="preserve">reads input and draws the screen,</w:t>
-      </w:r>
-      <w:r>
-        <w:t xml:space="preserve"> </w:t>
-      </w:r>
-      <w:r>
-        <w:t xml:space="preserve">control</w:t>
-      </w:r>
-      <w:r>
-        <w:t xml:space="preserve"> </w:t>
-      </w:r>
-      <w:r>
-        <w:t xml:space="preserve">runs the turn sequence,</w:t>
-      </w:r>
-      <w:r>
-        <w:t xml:space="preserve"> </w:t>
-      </w:r>
-      <w:r>
-        <w:t xml:space="preserve">staff</w:t>
-      </w:r>
-      <w:r>
-        <w:t xml:space="preserve"> </w:t>
-      </w:r>
-      <w:r>
-        <w:t xml:space="preserve">decides what each role may do,</w:t>
-      </w:r>
-      <w:r>
-        <w:t xml:space="preserve"> </w:t>
-      </w:r>
-      <w:r>
-        <w:t xml:space="preserve">policy</w:t>
-      </w:r>
-      <w:r>
-        <w:t xml:space="preserve"> </w:t>
-      </w:r>
-      <w:r>
-        <w:t xml:space="preserve">holds the pricing rules, and</w:t>
-      </w:r>
-      <w:r>
-        <w:t xml:space="preserve"> </w:t>
-      </w:r>
-      <w:r>
-        <w:t xml:space="preserve">model</w:t>
-      </w:r>
-      <w:r>
-        <w:t xml:space="preserve"> </w:t>
-      </w:r>
-      <w:r>
-        <w:t xml:space="preserve">holds the entities and their rules.</w:t>
-      </w:r>
-      <w:r>
-        <w:t xml:space="preserve"> </w:t>
-      </w:r>
-      <w:r>
-        <w:t xml:space="preserve">The small records (</w:t>
-      </w:r>
-      <w:r>
-        <w:rPr>
-          <w:rStyle w:val="VerbatimChar"/>
-        </w:rPr>
-        <w:t xml:space="preserve">Command</w:t>
-      </w:r>
-      <w:r>
-        <w:t xml:space="preserve">,</w:t>
-      </w:r>
-      <w:r>
-        <w:t xml:space="preserve"> </w:t>
-      </w:r>
-      <w:r>
-        <w:rPr>
-          <w:rStyle w:val="VerbatimChar"/>
-        </w:rPr>
-        <w:t xml:space="preserve">ActionResult</w:t>
-      </w:r>
-      <w:r>
-        <w:t xml:space="preserve">,</w:t>
-      </w:r>
-      <w:r>
-        <w:t xml:space="preserve"> </w:t>
-      </w:r>
-      <w:r>
-        <w:rPr>
-          <w:rStyle w:val="VerbatimChar"/>
-        </w:rPr>
-        <w:t xml:space="preserve">TurnContext</w:t>
-      </w:r>
-      <w:r>
-        <w:t xml:space="preserve">,</w:t>
-      </w:r>
-      <w:r>
-        <w:t xml:space="preserve"> </w:t>
-      </w:r>
-      <w:r>
-        <w:rPr>
-          <w:rStyle w:val="VerbatimChar"/>
-        </w:rPr>
-        <w:t xml:space="preserve">Objective</w:t>
-      </w:r>
-      <w:r>
-        <w:t xml:space="preserve">,</w:t>
-      </w:r>
-      <w:r>
-        <w:t xml:space="preserve"> </w:t>
-      </w:r>
-      <w:r>
-        <w:rPr>
-          <w:rStyle w:val="VerbatimChar"/>
-        </w:rPr>
-        <w:t xml:space="preserve">Scoreboard</w:t>
-      </w:r>
-      <w:r>
-        <w:t xml:space="preserve">,</w:t>
-      </w:r>
-      <w:r>
-        <w:t xml:space="preserve"> </w:t>
-      </w:r>
-      <w:r>
-        <w:rPr>
-          <w:rStyle w:val="VerbatimChar"/>
-        </w:rPr>
-        <w:t xml:space="preserve">GameResult</w:t>
-      </w:r>
-      <w:r>
-        <w:t xml:space="preserve">,</w:t>
-      </w:r>
-      <w:r>
-        <w:t xml:space="preserve"> </w:t>
-      </w:r>
-      <w:r>
-        <w:rPr>
-          <w:rStyle w:val="VerbatimChar"/>
-        </w:rPr>
         <w:t xml:space="preserve">GameEvent</w:t>
       </w:r>
       <w:r>
         <w:t xml:space="preserve">) are immutable value objects.</w:t>
       </w:r>
     </w:p>
-    <w:bookmarkEnd w:id="22"/>
-    <w:bookmarkStart w:id="23" w:name="uml-sequence-diagram"/>
+    <w:bookmarkEnd w:id="23"/>
+    <w:bookmarkStart w:id="24" w:name="uml-sequence-diagram"/>
     <w:p>
       <w:pPr>
         <w:pStyle w:val="Heading1"/>
@@ -2532,13 +2767,13 @@
         <w:t xml:space="preserve"> </w:t>
       </w:r>
       <w:r>
-        <w:t xml:space="preserve">after turn 18. The diagram is split into two parts so it stays readable when printed. Message numbers below</w:t>
-      </w:r>
-      <w:r>
-        <w:t xml:space="preserve"> </w:t>
-      </w:r>
-      <w:r>
-        <w:t xml:space="preserve">refer to the numbers on the arrows.</w:t>
+        <w:t xml:space="preserve">after turn 18. It is drawn in six parts so that it stays readable when printed. The message numbers carry on</w:t>
+      </w:r>
+      <w:r>
+        <w:t xml:space="preserve"> </w:t>
+      </w:r>
+      <w:r>
+        <w:t xml:space="preserve">from one part to the next, and the table below refers to them.</w:t>
       </w:r>
     </w:p>
     <w:tbl>
@@ -2627,7 +2862,39 @@
               <w:rPr>
                 <w:sz w:val="18"/>
               </w:rPr>
-              <w:t xml:space="preserve">Part A, messages 1–4 (arrival) and 22–37 (</w:t>
+              <w:t xml:space="preserve">Part 1, messages 1–7 (</w:t>
+            </w:r>
+            <w:r>
+              <w:rPr>
+                <w:rStyle w:val="VerbatimChar"/>
+                <w:sz w:val="18"/>
+              </w:rPr>
+              <w:t xml:space="preserve">arrivingOn</w:t>
+            </w:r>
+            <w:r>
+              <w:rPr>
+                <w:sz w:val="18"/>
+              </w:rPr>
+              <w:t xml:space="preserve">, «create»,</w:t>
+            </w:r>
+            <w:r>
+              <w:rPr>
+                <w:sz w:val="18"/>
+              </w:rPr>
+              <w:t xml:space="preserve"> </w:t>
+            </w:r>
+            <w:r>
+              <w:rPr>
+                <w:rStyle w:val="VerbatimChar"/>
+                <w:sz w:val="18"/>
+              </w:rPr>
+              <w:t xml:space="preserve">admit</w:t>
+            </w:r>
+            <w:r>
+              <w:rPr>
+                <w:sz w:val="18"/>
+              </w:rPr>
+              <w:t xml:space="preserve">); part 2, 27–44 (</w:t>
             </w:r>
             <w:r>
               <w:rPr>
@@ -2678,7 +2945,7 @@
               <w:rPr>
                 <w:sz w:val="18"/>
               </w:rPr>
-              <w:t xml:space="preserve">,</w:t>
+              <w:t xml:space="preserve">, «create»</w:t>
             </w:r>
             <w:r>
               <w:rPr>
@@ -2691,7 +2958,7 @@
                 <w:rStyle w:val="VerbatimChar"/>
                 <w:sz w:val="18"/>
               </w:rPr>
-              <w:t xml:space="preserve">«create» Order</w:t>
+              <w:t xml:space="preserve">Order</w:t>
             </w:r>
             <w:r>
               <w:rPr>
@@ -2729,7 +2996,64 @@
               <w:rPr>
                 <w:sz w:val="18"/>
               </w:rPr>
-              <w:t xml:space="preserve">Part A, 15–21 (Host), 22–37 (Waiter), 38–41 (Chef); Part B, 4–8 and 9–18</w:t>
+              <w:t xml:space="preserve">Host 18–26; Waiter 27–44 and 70–82; Chef 45–51 and 60–66. Every instruction goes through</w:t>
+            </w:r>
+            <w:r>
+              <w:rPr>
+                <w:sz w:val="18"/>
+              </w:rPr>
+              <w:t xml:space="preserve"> </w:t>
+            </w:r>
+            <w:r>
+              <w:rPr>
+                <w:rStyle w:val="VerbatimChar"/>
+                <w:sz w:val="18"/>
+              </w:rPr>
+              <w:t xml:space="preserve">Game.direct</w:t>
+            </w:r>
+            <w:r>
+              <w:rPr>
+                <w:sz w:val="18"/>
+              </w:rPr>
+              <w:t xml:space="preserve"> </w:t>
+            </w:r>
+            <w:r>
+              <w:rPr>
+                <w:sz w:val="18"/>
+              </w:rPr>
+              <w:t xml:space="preserve">and the template method</w:t>
+            </w:r>
+            <w:r>
+              <w:rPr>
+                <w:sz w:val="18"/>
+              </w:rPr>
+              <w:t xml:space="preserve"> </w:t>
+            </w:r>
+            <w:r>
+              <w:rPr>
+                <w:rStyle w:val="VerbatimChar"/>
+                <w:sz w:val="18"/>
+              </w:rPr>
+              <w:t xml:space="preserve">perform</w:t>
+            </w:r>
+            <w:r>
+              <w:rPr>
+                <w:sz w:val="18"/>
+              </w:rPr>
+              <w:t xml:space="preserve">, which calls</w:t>
+            </w:r>
+            <w:r>
+              <w:rPr>
+                <w:sz w:val="18"/>
+              </w:rPr>
+              <w:t xml:space="preserve"> </w:t>
+            </w:r>
+            <w:r>
+              <w:rPr>
+                <w:rStyle w:val="VerbatimChar"/>
+                <w:sz w:val="18"/>
+              </w:rPr>
+              <w:t xml:space="preserve">carryOut</w:t>
             </w:r>
           </w:p>
         </w:tc>
@@ -2761,7 +3085,7 @@
               <w:rPr>
                 <w:sz w:val="18"/>
               </w:rPr>
-              <w:t xml:space="preserve">Part B:</w:t>
+              <w:t xml:space="preserve">Part 3:</w:t>
             </w:r>
             <w:r>
               <w:rPr>
@@ -2786,7 +3110,7 @@
               <w:rPr>
                 <w:sz w:val="18"/>
               </w:rPr>
-              <w:t xml:space="preserve">sets READY (7–8);</w:t>
+              <w:t xml:space="preserve">makes the order READY (64). Part 4:</w:t>
             </w:r>
             <w:r>
               <w:rPr>
@@ -2811,7 +3135,7 @@
               <w:rPr>
                 <w:sz w:val="18"/>
               </w:rPr>
-              <w:t xml:space="preserve">is guarded by</w:t>
+              <w:t xml:space="preserve">(75) succeeds only if</w:t>
             </w:r>
             <w:r>
               <w:rPr>
@@ -2824,19 +3148,13 @@
                 <w:rStyle w:val="VerbatimChar"/>
                 <w:sz w:val="18"/>
               </w:rPr>
-              <w:t xml:space="preserve">[status == READY, readyTurn &lt; turn]</w:t>
-            </w:r>
-            <w:r>
-              <w:rPr>
-                <w:sz w:val="18"/>
-              </w:rPr>
-              <w:t xml:space="preserve"> </w:t>
-            </w:r>
-            <w:r>
-              <w:rPr>
-                <w:sz w:val="18"/>
-              </w:rPr>
-              <w:t xml:space="preserve">(12–15)</w:t>
+              <w:t xml:space="preserve">status == READY and readyTurn &lt; turn</w:t>
+            </w:r>
+            <w:r>
+              <w:rPr>
+                <w:sz w:val="18"/>
+              </w:rPr>
+              <w:t xml:space="preserve">, otherwise it is rejected and the task is not used (76–82)</w:t>
             </w:r>
           </w:p>
         </w:tc>
@@ -2868,7 +3186,7 @@
               <w:rPr>
                 <w:sz w:val="18"/>
               </w:rPr>
-              <w:t xml:space="preserve">Part B:</w:t>
+              <w:t xml:space="preserve">Part 5:</w:t>
             </w:r>
             <w:r>
               <w:rPr>
@@ -2893,7 +3211,7 @@
               <w:rPr>
                 <w:sz w:val="18"/>
               </w:rPr>
-              <w:t xml:space="preserve">(20); on turn 11</w:t>
+              <w:t xml:space="preserve">(84). On turn 10 the Cashier charges Ben, who has been ready longer (86–90). On turn 11:</w:t>
             </w:r>
             <w:r>
               <w:rPr>
@@ -2950,7 +3268,32 @@
               <w:rPr>
                 <w:sz w:val="18"/>
               </w:rPr>
-              <w:t xml:space="preserve">, table released, revenue added (24–34)</w:t>
+              <w:t xml:space="preserve">,</w:t>
+            </w:r>
+            <w:r>
+              <w:rPr>
+                <w:sz w:val="18"/>
+              </w:rPr>
+              <w:t xml:space="preserve"> </w:t>
+            </w:r>
+            <w:r>
+              <w:rPr>
+                <w:rStyle w:val="VerbatimChar"/>
+                <w:sz w:val="18"/>
+              </w:rPr>
+              <w:t xml:space="preserve">release()</w:t>
+            </w:r>
+            <w:r>
+              <w:rPr>
+                <w:sz w:val="18"/>
+              </w:rPr>
+              <w:t xml:space="preserve"> </w:t>
+            </w:r>
+            <w:r>
+              <w:rPr>
+                <w:sz w:val="18"/>
+              </w:rPr>
+              <w:t xml:space="preserve">and the revenue update (92–106)</w:t>
             </w:r>
           </w:p>
         </w:tc>
@@ -2982,7 +3325,7 @@
               <w:rPr>
                 <w:sz w:val="18"/>
               </w:rPr>
-              <w:t xml:space="preserve">Part B, 35–39:</w:t>
+              <w:t xml:space="preserve">Part 6, 107–117:</w:t>
             </w:r>
             <w:r>
               <w:rPr>
@@ -3001,13 +3344,26 @@
               <w:rPr>
                 <w:sz w:val="18"/>
               </w:rPr>
+              <w:t xml:space="preserve">,</w:t>
+            </w:r>
+            <w:r>
+              <w:rPr>
+                <w:sz w:val="18"/>
+              </w:rPr>
               <w:t xml:space="preserve"> </w:t>
             </w:r>
             <w:r>
               <w:rPr>
-                <w:sz w:val="18"/>
-              </w:rPr>
-              <w:t xml:space="preserve">calls</w:t>
+                <w:rStyle w:val="VerbatimChar"/>
+                <w:sz w:val="18"/>
+              </w:rPr>
+              <w:t xml:space="preserve">Objective.evaluate</w:t>
+            </w:r>
+            <w:r>
+              <w:rPr>
+                <w:sz w:val="18"/>
+              </w:rPr>
+              <w:t xml:space="preserve">,</w:t>
             </w:r>
             <w:r>
               <w:rPr>
@@ -3020,7 +3376,13 @@
                 <w:rStyle w:val="VerbatimChar"/>
                 <w:sz w:val="18"/>
               </w:rPr>
-              <w:t xml:space="preserve">Objective.evaluate(scoreboard())</w:t>
+              <w:t xml:space="preserve">GameResult.isVictory()</w:t>
+            </w:r>
+            <w:r>
+              <w:rPr>
+                <w:sz w:val="18"/>
+              </w:rPr>
+              <w:t xml:space="preserve">, then the Victory or Defeat screen</w:t>
             </w:r>
           </w:p>
         </w:tc>
@@ -3065,7 +3427,7 @@
               <w:rPr>
                 <w:sz w:val="18"/>
               </w:rPr>
-              <w:t xml:space="preserve">, 10% off) and Happy Hour (</w:t>
+              <w:t xml:space="preserve">, 10% off, 35–36); Happy Hour (</w:t>
             </w:r>
             <w:r>
               <w:rPr>
@@ -3097,10 +3459,29 @@
               <w:rPr>
                 <w:sz w:val="18"/>
               </w:rPr>
+              <w:t xml:space="preserve">,</w:t>
+            </w:r>
+            <w:r>
+              <w:rPr>
+                <w:sz w:val="18"/>
+              </w:rPr>
               <w:t xml:space="preserve"> </w:t>
             </w:r>
             <w:r>
               <w:rPr>
+                <w:rStyle w:val="VerbatimChar"/>
+                <w:sz w:val="18"/>
+              </w:rPr>
+              <w:t xml:space="preserve">recover</w:t>
+            </w:r>
+            <w:r>
+              <w:rPr>
+                <w:sz w:val="18"/>
+              </w:rPr>
+              <w:t xml:space="preserve"> </w:t>
+            </w:r>
+            <w:r>
+              <w:rPr>
                 <w:sz w:val="18"/>
               </w:rPr>
               <w:t xml:space="preserve">and</w:t>
@@ -3116,32 +3497,13 @@
                 <w:rStyle w:val="VerbatimChar"/>
                 <w:sz w:val="18"/>
               </w:rPr>
-              <w:t xml:space="preserve">recover</w:t>
-            </w:r>
-            <w:r>
-              <w:rPr>
-                <w:sz w:val="18"/>
-              </w:rPr>
-              <w:t xml:space="preserve">,</w:t>
-            </w:r>
-            <w:r>
-              <w:rPr>
-                <w:sz w:val="18"/>
-              </w:rPr>
-              <w:t xml:space="preserve"> </w:t>
-            </w:r>
-            <w:r>
-              <w:rPr>
-                <w:rStyle w:val="VerbatimChar"/>
-                <w:sz w:val="18"/>
-              </w:rPr>
               <w:t xml:space="preserve">adjust</w:t>
             </w:r>
             <w:r>
               <w:rPr>
                 <w:sz w:val="18"/>
               </w:rPr>
-              <w:t xml:space="preserve">, 20% off)</w:t>
+              <w:t xml:space="preserve">, 10–17, 37–38 and 56–58); the Host (18–26)</w:t>
             </w:r>
           </w:p>
         </w:tc>
@@ -3186,7 +3548,7 @@
               <w:rPr>
                 <w:sz w:val="18"/>
               </w:rPr>
-              <w:t xml:space="preserve">over turns, waiting customers and recovery;</w:t>
+              <w:t xml:space="preserve">over turns, waiting customers, price modifiers, guests and the Waiter's retries;</w:t>
             </w:r>
             <w:r>
               <w:rPr>
@@ -3230,7 +3592,7 @@
               <w:rPr>
                 <w:sz w:val="18"/>
               </w:rPr>
-              <w:t xml:space="preserve">for a serve that succeeds or is rejected;</w:t>
+              <w:t xml:space="preserve">for the manager's Happy Hour answer, a serve that succeeds or is rejected, and Victory or Defeat;</w:t>
             </w:r>
             <w:r>
               <w:rPr>
@@ -3272,11 +3634,13 @@
         </w:rPr>
         <w:t xml:space="preserve">The manager choice that changes the outcome</w:t>
       </w:r>
-      <w:r>
-        <w:t xml:space="preserve"> </w:t>
-      </w:r>
-      <w:r>
-        <w:t xml:space="preserve">On turn 7 the manager switches on Happy Hour before the Waiter takes Chloe's order.</w:t>
+    </w:p>
+    <w:p>
+      <w:pPr>
+        <w:pStyle w:val="BodyText"/>
+      </w:pPr>
+      <w:r>
+        <w:t xml:space="preserve">On turn 7 the manager answers</w:t>
       </w:r>
       <w:r>
         <w:t xml:space="preserve"> </w:t>
@@ -3285,19 +3649,34 @@
         <w:rPr>
           <w:rStyle w:val="VerbatimChar"/>
         </w:rPr>
+        <w:t xml:space="preserve">y</w:t>
+      </w:r>
+      <w:r>
+        <w:t xml:space="preserve"> </w:t>
+      </w:r>
+      <w:r>
+        <w:t xml:space="preserve">to Happy Hour (message 9) before the Waiter takes Chloe's order.</w:t>
+      </w:r>
+      <w:r>
+        <w:t xml:space="preserve"> </w:t>
+      </w:r>
+      <w:r>
+        <w:rPr>
+          <w:rStyle w:val="VerbatimChar"/>
+        </w:rPr>
         <w:t xml:space="preserve">PricingPolicy.quote</w:t>
       </w:r>
       <w:r>
         <w:t xml:space="preserve"> </w:t>
       </w:r>
       <w:r>
-        <w:t xml:space="preserve">applies the VIP discount first and then Happy Hour, so her Pasta is locked at</w:t>
-      </w:r>
-      <w:r>
-        <w:t xml:space="preserve"> </w:t>
-      </w:r>
-      <w:r>
-        <w:t xml:space="preserve">$18.00 × 0.9 × 0.8 =</w:t>
+        <w:t xml:space="preserve">applies the VIP discount first and then Happy Hour (34–39), so her Pasta is locked</w:t>
+      </w:r>
+      <w:r>
+        <w:t xml:space="preserve"> </w:t>
+      </w:r>
+      <w:r>
+        <w:t xml:space="preserve">at $18.00 × 0.9 × 0.8 =</w:t>
       </w:r>
       <w:r>
         <w:t xml:space="preserve"> </w:t>
@@ -3338,12 +3717,12 @@
         <w:t xml:space="preserve">(see Section 5).</w:t>
       </w:r>
     </w:p>
-    <w:bookmarkEnd w:id="23"/>
-    <w:bookmarkStart w:id="27" w:name="Xcc1b14f2fe4410188d29990038aa5370ce36eae"/>
+    <w:bookmarkEnd w:id="24"/>
+    <w:bookmarkStart w:id="28" w:name="X8003bbb690051f06ca83b0835cd72f447272337"/>
     <w:p>
       <w:pPr>
         <w:sectPr>
-          <w:footerReference w:type="default" r:id="rId11"/>
+          <w:footerReference w:type="default" r:id="rId12"/>
           <w:footnotePr>
             <w:numRestart w:val="eachSect"/>
           </w:footnotePr>
@@ -3358,7 +3737,7 @@
         <w:pageBreakBefore w:val="0"/>
       </w:pPr>
       <w:r>
-        <w:t xml:space="preserve">3A. Turn 7: arrival, Happy Hour, seating, ordering and pricing</w:t>
+        <w:t xml:space="preserve">Sequence diagram, part 1. Turn 7: arrival, Happy Hour and seating (messages 1–26)</w:t>
       </w:r>
     </w:p>
     <w:p>
@@ -3375,7 +3754,7 @@
         <w:rPr>
           <w:rStyle w:val="VerbatimChar"/>
         </w:rPr>
-        <w:t xml:space="preserve">docs/diagrams/sequence-1-arrival-order.drawio</w:t>
+        <w:t xml:space="preserve">docs/diagrams/sequence-1-arrival-seating.drawio</w:t>
       </w:r>
     </w:p>
     <w:p>
@@ -3385,20 +3764,20 @@
       <w:r>
         <w:drawing>
           <wp:inline>
-            <wp:extent cx="5334000" cy="5212311"/>
+            <wp:extent cx="13049721" cy="8639999"/>
             <wp:effectExtent b="0" l="0" r="0" t="0"/>
-            <wp:docPr descr="WIDE:Sequence diagram part A" title="" id="25" name="Picture"/>
+            <wp:docPr descr="Sequence diagram part 1" title="Sequence diagram part 1" id="26" name="Picture"/>
             <a:graphic>
               <a:graphicData uri="http://schemas.openxmlformats.org/drawingml/2006/picture">
                 <pic:pic>
                   <pic:nvPicPr>
-                    <pic:cNvPr descr="img/SEQ_1.png" id="26" name="Picture"/>
+                    <pic:cNvPr descr="img/SEQ_1.png" id="27" name="Picture"/>
                     <pic:cNvPicPr>
                       <a:picLocks noChangeArrowheads="1" noChangeAspect="1"/>
                     </pic:cNvPicPr>
                   </pic:nvPicPr>
                   <pic:blipFill>
-                    <a:blip r:embed="rId24"/>
+                    <a:blip r:embed="rId25"/>
                     <a:stretch>
                       <a:fillRect/>
                     </a:stretch>
@@ -3406,7 +3785,7 @@
                   <pic:spPr bwMode="auto">
                     <a:xfrm>
                       <a:off x="0" y="0"/>
-                      <a:ext cx="5334000" cy="5212311"/>
+                      <a:ext cx="13049721" cy="8639999"/>
                     </a:xfrm>
                     <a:prstGeom prst="rect">
                       <a:avLst/>
@@ -3425,14 +3804,14 @@
         </w:drawing>
       </w:r>
     </w:p>
-    <w:bookmarkEnd w:id="27"/>
-    <w:bookmarkStart w:id="31" w:name="Xd61d40621427d82ecc898f4223e89dd429a829b"/>
+    <w:bookmarkEnd w:id="28"/>
+    <w:bookmarkStart w:id="32" w:name="X8d60a25293d55b63d3bc8dd47a4f046c92e3fca"/>
     <w:p>
       <w:pPr>
         <w:pStyle w:val="Heading1"/>
       </w:pPr>
       <w:r>
-        <w:t xml:space="preserve">3B. Turns 8 to 11: READY, SERVED, eating, payment and the result check</w:t>
+        <w:t xml:space="preserve">Sequence diagram, part 2. Turn 7: ordering, pricing and cooking (messages 27–54)</w:t>
       </w:r>
     </w:p>
     <w:p>
@@ -3449,38 +3828,30 @@
         <w:rPr>
           <w:rStyle w:val="VerbatimChar"/>
         </w:rPr>
-        <w:t xml:space="preserve">docs/diagrams/sequence-2-service-payment.drawio</w:t>
+        <w:t xml:space="preserve">docs/diagrams/sequence-2-order-pricing.drawio</w:t>
       </w:r>
     </w:p>
     <w:p>
       <w:pPr>
         <w:pStyle w:val="BodyText"/>
-        <w:sectPr>
-          <w:footerReference w:type="default" r:id="rId12"/>
-          <w:footnotePr>
-            <w:numRestart w:val="eachSect"/>
-          </w:footnotePr>
-          <w:pgSz w:w="23811" w:h="16838" w:orient="landscape"/>
-          <w:pgMar w:left="680" w:right="680" w:top="680" w:bottom="680"/>
-        </w:sectPr>
       </w:pPr>
       <w:r>
         <w:drawing>
           <wp:inline>
-            <wp:extent cx="5334000" cy="5128310"/>
+            <wp:extent cx="10380320" cy="8639999"/>
             <wp:effectExtent b="0" l="0" r="0" t="0"/>
-            <wp:docPr descr="WIDE:Sequence diagram part B" title="" id="29" name="Picture"/>
+            <wp:docPr descr="Sequence diagram part 2" title="Sequence diagram part 2" id="30" name="Picture"/>
             <a:graphic>
               <a:graphicData uri="http://schemas.openxmlformats.org/drawingml/2006/picture">
                 <pic:pic>
                   <pic:nvPicPr>
-                    <pic:cNvPr descr="img/SEQ_2.png" id="30" name="Picture"/>
+                    <pic:cNvPr descr="img/SEQ_2.png" id="31" name="Picture"/>
                     <pic:cNvPicPr>
                       <a:picLocks noChangeArrowheads="1" noChangeAspect="1"/>
                     </pic:cNvPicPr>
                   </pic:nvPicPr>
                   <pic:blipFill>
-                    <a:blip r:embed="rId28"/>
+                    <a:blip r:embed="rId29"/>
                     <a:stretch>
                       <a:fillRect/>
                     </a:stretch>
@@ -3488,7 +3859,7 @@
                   <pic:spPr bwMode="auto">
                     <a:xfrm>
                       <a:off x="0" y="0"/>
-                      <a:ext cx="5334000" cy="5128310"/>
+                      <a:ext cx="10380320" cy="8639999"/>
                     </a:xfrm>
                     <a:prstGeom prst="rect">
                       <a:avLst/>
@@ -3507,8 +3878,312 @@
         </w:drawing>
       </w:r>
     </w:p>
-    <w:bookmarkEnd w:id="31"/>
-    <w:bookmarkStart w:id="35" w:name="design-discussion"/>
+    <w:bookmarkEnd w:id="32"/>
+    <w:bookmarkStart w:id="36" w:name="X24a1a7c2faba4b7d303090c1865d4475b044409"/>
+    <w:p>
+      <w:pPr>
+        <w:pStyle w:val="Heading1"/>
+      </w:pPr>
+      <w:r>
+        <w:t xml:space="preserve">Sequence diagram, part 3. Turn 8: the order becomes READY (messages 55–69)</w:t>
+      </w:r>
+    </w:p>
+    <w:p>
+      <w:pPr>
+        <w:pStyle w:val="FirstParagraph"/>
+      </w:pPr>
+      <w:r>
+        <w:t xml:space="preserve">Editable version:</w:t>
+      </w:r>
+      <w:r>
+        <w:t xml:space="preserve"> </w:t>
+      </w:r>
+      <w:r>
+        <w:rPr>
+          <w:rStyle w:val="VerbatimChar"/>
+        </w:rPr>
+        <w:t xml:space="preserve">docs/diagrams/sequence-3-ready.drawio</w:t>
+      </w:r>
+    </w:p>
+    <w:p>
+      <w:pPr>
+        <w:pStyle w:val="BodyText"/>
+      </w:pPr>
+      <w:r>
+        <w:drawing>
+          <wp:inline>
+            <wp:extent cx="12226277" cy="8639998"/>
+            <wp:effectExtent b="0" l="0" r="0" t="0"/>
+            <wp:docPr descr="Sequence diagram part 3" title="Sequence diagram part 3" id="34" name="Picture"/>
+            <a:graphic>
+              <a:graphicData uri="http://schemas.openxmlformats.org/drawingml/2006/picture">
+                <pic:pic>
+                  <pic:nvPicPr>
+                    <pic:cNvPr descr="img/SEQ_3.png" id="35" name="Picture"/>
+                    <pic:cNvPicPr>
+                      <a:picLocks noChangeArrowheads="1" noChangeAspect="1"/>
+                    </pic:cNvPicPr>
+                  </pic:nvPicPr>
+                  <pic:blipFill>
+                    <a:blip r:embed="rId33"/>
+                    <a:stretch>
+                      <a:fillRect/>
+                    </a:stretch>
+                  </pic:blipFill>
+                  <pic:spPr bwMode="auto">
+                    <a:xfrm>
+                      <a:off x="0" y="0"/>
+                      <a:ext cx="12226277" cy="8639998"/>
+                    </a:xfrm>
+                    <a:prstGeom prst="rect">
+                      <a:avLst/>
+                    </a:prstGeom>
+                    <a:noFill/>
+                    <a:ln w="9525">
+                      <a:noFill/>
+                      <a:headEnd/>
+                      <a:tailEnd/>
+                    </a:ln>
+                  </pic:spPr>
+                </pic:pic>
+              </a:graphicData>
+            </a:graphic>
+          </wp:inline>
+        </w:drawing>
+      </w:r>
+    </w:p>
+    <w:bookmarkEnd w:id="36"/>
+    <w:bookmarkStart w:id="40" w:name="X9e0bc8f45138a978fa37c93e7d0b57b2f5c3a7b"/>
+    <w:p>
+      <w:pPr>
+        <w:pStyle w:val="Heading1"/>
+      </w:pPr>
+      <w:r>
+        <w:t xml:space="preserve">Sequence diagram, part 4. Turn 9: the order is SERVED (messages 70–82)</w:t>
+      </w:r>
+    </w:p>
+    <w:p>
+      <w:pPr>
+        <w:pStyle w:val="FirstParagraph"/>
+      </w:pPr>
+      <w:r>
+        <w:t xml:space="preserve">Editable version:</w:t>
+      </w:r>
+      <w:r>
+        <w:t xml:space="preserve"> </w:t>
+      </w:r>
+      <w:r>
+        <w:rPr>
+          <w:rStyle w:val="VerbatimChar"/>
+        </w:rPr>
+        <w:t xml:space="preserve">docs/diagrams/sequence-4-served.drawio</w:t>
+      </w:r>
+    </w:p>
+    <w:p>
+      <w:pPr>
+        <w:pStyle w:val="BodyText"/>
+      </w:pPr>
+      <w:r>
+        <w:drawing>
+          <wp:inline>
+            <wp:extent cx="11117273" cy="8639999"/>
+            <wp:effectExtent b="0" l="0" r="0" t="0"/>
+            <wp:docPr descr="Sequence diagram part 4" title="Sequence diagram part 4" id="38" name="Picture"/>
+            <a:graphic>
+              <a:graphicData uri="http://schemas.openxmlformats.org/drawingml/2006/picture">
+                <pic:pic>
+                  <pic:nvPicPr>
+                    <pic:cNvPr descr="img/SEQ_4.png" id="39" name="Picture"/>
+                    <pic:cNvPicPr>
+                      <a:picLocks noChangeArrowheads="1" noChangeAspect="1"/>
+                    </pic:cNvPicPr>
+                  </pic:nvPicPr>
+                  <pic:blipFill>
+                    <a:blip r:embed="rId37"/>
+                    <a:stretch>
+                      <a:fillRect/>
+                    </a:stretch>
+                  </pic:blipFill>
+                  <pic:spPr bwMode="auto">
+                    <a:xfrm>
+                      <a:off x="0" y="0"/>
+                      <a:ext cx="11117273" cy="8639999"/>
+                    </a:xfrm>
+                    <a:prstGeom prst="rect">
+                      <a:avLst/>
+                    </a:prstGeom>
+                    <a:noFill/>
+                    <a:ln w="9525">
+                      <a:noFill/>
+                      <a:headEnd/>
+                      <a:tailEnd/>
+                    </a:ln>
+                  </pic:spPr>
+                </pic:pic>
+              </a:graphicData>
+            </a:graphic>
+          </wp:inline>
+        </w:drawing>
+      </w:r>
+    </w:p>
+    <w:bookmarkEnd w:id="40"/>
+    <w:bookmarkStart w:id="44" w:name="X6c700660aae780778b44ff36ed29ad7dc18120a"/>
+    <w:p>
+      <w:pPr>
+        <w:pStyle w:val="Heading1"/>
+      </w:pPr>
+      <w:r>
+        <w:t xml:space="preserve">Sequence diagram, part 5. Turns 10 and 11: eating and payment (messages 83–106)</w:t>
+      </w:r>
+    </w:p>
+    <w:p>
+      <w:pPr>
+        <w:pStyle w:val="FirstParagraph"/>
+      </w:pPr>
+      <w:r>
+        <w:t xml:space="preserve">Editable version:</w:t>
+      </w:r>
+      <w:r>
+        <w:t xml:space="preserve"> </w:t>
+      </w:r>
+      <w:r>
+        <w:rPr>
+          <w:rStyle w:val="VerbatimChar"/>
+        </w:rPr>
+        <w:t xml:space="preserve">docs/diagrams/sequence-5-eating-payment.drawio</w:t>
+      </w:r>
+    </w:p>
+    <w:p>
+      <w:pPr>
+        <w:pStyle w:val="BodyText"/>
+      </w:pPr>
+      <w:r>
+        <w:drawing>
+          <wp:inline>
+            <wp:extent cx="9997502" cy="8639999"/>
+            <wp:effectExtent b="0" l="0" r="0" t="0"/>
+            <wp:docPr descr="Sequence diagram part 5" title="Sequence diagram part 5" id="42" name="Picture"/>
+            <a:graphic>
+              <a:graphicData uri="http://schemas.openxmlformats.org/drawingml/2006/picture">
+                <pic:pic>
+                  <pic:nvPicPr>
+                    <pic:cNvPr descr="img/SEQ_5.png" id="43" name="Picture"/>
+                    <pic:cNvPicPr>
+                      <a:picLocks noChangeArrowheads="1" noChangeAspect="1"/>
+                    </pic:cNvPicPr>
+                  </pic:nvPicPr>
+                  <pic:blipFill>
+                    <a:blip r:embed="rId41"/>
+                    <a:stretch>
+                      <a:fillRect/>
+                    </a:stretch>
+                  </pic:blipFill>
+                  <pic:spPr bwMode="auto">
+                    <a:xfrm>
+                      <a:off x="0" y="0"/>
+                      <a:ext cx="9997502" cy="8639999"/>
+                    </a:xfrm>
+                    <a:prstGeom prst="rect">
+                      <a:avLst/>
+                    </a:prstGeom>
+                    <a:noFill/>
+                    <a:ln w="9525">
+                      <a:noFill/>
+                      <a:headEnd/>
+                      <a:tailEnd/>
+                    </a:ln>
+                  </pic:spPr>
+                </pic:pic>
+              </a:graphicData>
+            </a:graphic>
+          </wp:inline>
+        </w:drawing>
+      </w:r>
+    </w:p>
+    <w:bookmarkEnd w:id="44"/>
+    <w:bookmarkStart w:id="48" w:name="Xae5251c7d24326843d4e8ae78d9643d47b04ae2"/>
+    <w:p>
+      <w:pPr>
+        <w:pStyle w:val="Heading1"/>
+      </w:pPr>
+      <w:r>
+        <w:t xml:space="preserve">Sequence diagram, part 6. After turn 18: the result check (messages 107–117)</w:t>
+      </w:r>
+    </w:p>
+    <w:p>
+      <w:pPr>
+        <w:pStyle w:val="FirstParagraph"/>
+      </w:pPr>
+      <w:r>
+        <w:t xml:space="preserve">Editable version:</w:t>
+      </w:r>
+      <w:r>
+        <w:t xml:space="preserve"> </w:t>
+      </w:r>
+      <w:r>
+        <w:rPr>
+          <w:rStyle w:val="VerbatimChar"/>
+        </w:rPr>
+        <w:t xml:space="preserve">docs/diagrams/sequence-6-result.drawio</w:t>
+      </w:r>
+    </w:p>
+    <w:p>
+      <w:pPr>
+        <w:pStyle w:val="BodyText"/>
+        <w:sectPr>
+          <w:footerReference w:type="default" r:id="rId13"/>
+          <w:footnotePr>
+            <w:numRestart w:val="eachSect"/>
+          </w:footnotePr>
+          <w:pgSz w:w="23811" w:h="16838" w:orient="landscape"/>
+          <w:pgMar w:left="680" w:right="680" w:top="680" w:bottom="680"/>
+        </w:sectPr>
+      </w:pPr>
+      <w:r>
+        <w:drawing>
+          <wp:inline>
+            <wp:extent cx="7456948" cy="4319998"/>
+            <wp:effectExtent b="0" l="0" r="0" t="0"/>
+            <wp:docPr descr="Sequence diagram part 6" title="Sequence diagram part 6" id="46" name="Picture"/>
+            <a:graphic>
+              <a:graphicData uri="http://schemas.openxmlformats.org/drawingml/2006/picture">
+                <pic:pic>
+                  <pic:nvPicPr>
+                    <pic:cNvPr descr="img/SEQ_6.png" id="47" name="Picture"/>
+                    <pic:cNvPicPr>
+                      <a:picLocks noChangeArrowheads="1" noChangeAspect="1"/>
+                    </pic:cNvPicPr>
+                  </pic:nvPicPr>
+                  <pic:blipFill>
+                    <a:blip r:embed="rId45"/>
+                    <a:stretch>
+                      <a:fillRect/>
+                    </a:stretch>
+                  </pic:blipFill>
+                  <pic:spPr bwMode="auto">
+                    <a:xfrm>
+                      <a:off x="0" y="0"/>
+                      <a:ext cx="7456948" cy="4319998"/>
+                    </a:xfrm>
+                    <a:prstGeom prst="rect">
+                      <a:avLst/>
+                    </a:prstGeom>
+                    <a:noFill/>
+                    <a:ln w="9525">
+                      <a:noFill/>
+                      <a:headEnd/>
+                      <a:tailEnd/>
+                    </a:ln>
+                  </pic:spPr>
+                </pic:pic>
+              </a:graphicData>
+            </a:graphic>
+          </wp:inline>
+        </w:drawing>
+      </w:r>
+    </w:p>
+    <w:bookmarkEnd w:id="48"/>
+    <w:bookmarkStart w:id="52" w:name="design-discussion"/>
     <w:p>
       <w:pPr>
         <w:pStyle w:val="Heading1"/>
@@ -3518,7 +4193,7 @@
         <w:t xml:space="preserve">4 Design discussion</w:t>
       </w:r>
     </w:p>
-    <w:bookmarkStart w:id="32" w:name="X72de1e2cf4c2513d02040fd8d68d77b38b930d9"/>
+    <w:bookmarkStart w:id="49" w:name="X72de1e2cf4c2513d02040fd8d68d77b38b930d9"/>
     <w:p>
       <w:pPr>
         <w:pStyle w:val="Heading2"/>
@@ -4546,8 +5221,8 @@
         </w:tc>
       </w:tr>
     </w:tbl>
-    <w:bookmarkEnd w:id="32"/>
-    <w:bookmarkStart w:id="33" w:name="design-principles-in-the-code"/>
+    <w:bookmarkEnd w:id="49"/>
+    <w:bookmarkStart w:id="50" w:name="design-principles-in-the-code"/>
     <w:p>
       <w:pPr>
         <w:pStyle w:val="Heading2"/>
@@ -4775,13 +5450,40 @@
         <w:t xml:space="preserve">GameConfig</w:t>
       </w:r>
       <w:r>
-        <w:t xml:space="preserve">, and the console's staff loop prompts it</w:t>
-      </w:r>
-      <w:r>
-        <w:t xml:space="preserve"> </w:t>
-      </w:r>
-      <w:r>
-        <w:t xml:space="preserve">without any change. Combos needed no change to</w:t>
+        <w:t xml:space="preserve">, and the console's loop over</w:t>
+      </w:r>
+      <w:r>
+        <w:t xml:space="preserve"> </w:t>
+      </w:r>
+      <w:r>
+        <w:rPr>
+          <w:rStyle w:val="VerbatimChar"/>
+        </w:rPr>
+        <w:t xml:space="preserve">game.directedStaff()</w:t>
+      </w:r>
+      <w:r>
+        <w:t xml:space="preserve"> </w:t>
+      </w:r>
+      <w:r>
+        <w:t xml:space="preserve">picks it up unchanged (</w:t>
+      </w:r>
+      <w:r>
+        <w:rPr>
+          <w:rStyle w:val="VerbatimChar"/>
+        </w:rPr>
+        <w:t xml:space="preserve">ConsoleUI</w:t>
+      </w:r>
+      <w:r>
+        <w:t xml:space="preserve"> </w:t>
+      </w:r>
+      <w:r>
+        <w:t xml:space="preserve">changed only for the Happy Hour</w:t>
+      </w:r>
+      <w:r>
+        <w:t xml:space="preserve"> </w:t>
+      </w:r>
+      <w:r>
+        <w:t xml:space="preserve">prompt and auto-wait, see Section 6). Combos needed no change to</w:t>
       </w:r>
       <w:r>
         <w:t xml:space="preserve"> </w:t>
@@ -5219,8 +5921,8 @@
         <w:t xml:space="preserve">policies were added.</w:t>
       </w:r>
     </w:p>
-    <w:bookmarkEnd w:id="33"/>
-    <w:bookmarkStart w:id="34" w:name="patterns-we-used"/>
+    <w:bookmarkEnd w:id="50"/>
+    <w:bookmarkStart w:id="51" w:name="patterns-we-used"/>
     <w:p>
       <w:pPr>
         <w:pStyle w:val="Heading2"/>
@@ -5367,7 +6069,7 @@
               <w:rPr>
                 <w:sz w:val="18"/>
               </w:rPr>
-              <w:t xml:space="preserve">Composite</w:t>
+              <w:t xml:space="preserve">Composite (one level)</w:t>
             </w:r>
           </w:p>
         </w:tc>
@@ -5436,7 +6138,32 @@
               <w:rPr>
                 <w:sz w:val="18"/>
               </w:rPr>
-              <w:t xml:space="preserve">A combo is a menu item made of menu items, so its price and units are derived rather than copied.</w:t>
+              <w:t xml:space="preserve">A combo is a menu item built from two</w:t>
+            </w:r>
+            <w:r>
+              <w:rPr>
+                <w:sz w:val="18"/>
+              </w:rPr>
+              <w:t xml:space="preserve"> </w:t>
+            </w:r>
+            <w:r>
+              <w:rPr>
+                <w:rStyle w:val="VerbatimChar"/>
+                <w:sz w:val="18"/>
+              </w:rPr>
+              <w:t xml:space="preserve">Dish</w:t>
+            </w:r>
+            <w:r>
+              <w:rPr>
+                <w:sz w:val="18"/>
+              </w:rPr>
+              <w:t xml:space="preserve"> </w:t>
+            </w:r>
+            <w:r>
+              <w:rPr>
+                <w:sz w:val="18"/>
+              </w:rPr>
+              <w:t xml:space="preserve">leaves, so its price and units are derived rather than copied. A combo cannot contain another combo.</w:t>
             </w:r>
           </w:p>
         </w:tc>
@@ -5623,9 +6350,9 @@
         </w:tc>
       </w:tr>
     </w:tbl>
-    <w:bookmarkEnd w:id="34"/>
-    <w:bookmarkEnd w:id="35"/>
-    <w:bookmarkStart w:id="36" w:name="trade-offs"/>
+    <w:bookmarkEnd w:id="51"/>
+    <w:bookmarkEnd w:id="52"/>
+    <w:bookmarkStart w:id="53" w:name="trade-offs"/>
     <w:p>
       <w:pPr>
         <w:pStyle w:val="Heading2"/>
@@ -6155,8 +6882,8 @@
         </w:tc>
       </w:tr>
     </w:tbl>
-    <w:bookmarkEnd w:id="36"/>
-    <w:bookmarkStart w:id="37" w:name="X68048cf7c63170a272763936876df10970a523b"/>
+    <w:bookmarkEnd w:id="53"/>
+    <w:bookmarkStart w:id="54" w:name="X68048cf7c63170a272763936876df10970a523b"/>
     <w:p>
       <w:pPr>
         <w:pStyle w:val="Heading2"/>
@@ -6322,8 +7049,8 @@
         <w:t xml:space="preserve">.</w:t>
       </w:r>
     </w:p>
-    <w:bookmarkEnd w:id="37"/>
-    <w:bookmarkStart w:id="41" w:name="X933f839243b942e702860440f71dadcc769bb96"/>
+    <w:bookmarkEnd w:id="54"/>
+    <w:bookmarkStart w:id="58" w:name="X933f839243b942e702860440f71dadcc769bb96"/>
     <w:p>
       <w:pPr>
         <w:pStyle w:val="Heading1"/>
@@ -6361,7 +7088,7 @@
         <w:t xml:space="preserve">and in Stage 3 with and without the Host and with different Happy Hour turns.</w:t>
       </w:r>
     </w:p>
-    <w:bookmarkStart w:id="38" w:name="stage-1"/>
+    <w:bookmarkStart w:id="55" w:name="stage-1"/>
     <w:p>
       <w:pPr>
         <w:pStyle w:val="Heading2"/>
@@ -6874,8 +7601,8 @@
         </w:tc>
       </w:tr>
     </w:tbl>
-    <w:bookmarkEnd w:id="38"/>
-    <w:bookmarkStart w:id="39" w:name="stage-2-critic-and-vip"/>
+    <w:bookmarkEnd w:id="55"/>
+    <w:bookmarkStart w:id="56" w:name="stage-2-critic-and-vip"/>
     <w:p>
       <w:pPr>
         <w:pStyle w:val="Heading2"/>
@@ -7296,8 +8023,8 @@
         </w:tc>
       </w:tr>
     </w:tbl>
-    <w:bookmarkEnd w:id="39"/>
-    <w:bookmarkStart w:id="40" w:name="stage-3-host-combos-happy-hour"/>
+    <w:bookmarkEnd w:id="56"/>
+    <w:bookmarkStart w:id="57" w:name="stage-3-host-combos-happy-hour"/>
     <w:p>
       <w:pPr>
         <w:pStyle w:val="Heading2"/>
@@ -8304,9 +9031,9 @@
         <w:t xml:space="preserve">On turn 14 it helps nobody who can still pay before the game ends.</w:t>
       </w:r>
     </w:p>
-    <w:bookmarkEnd w:id="40"/>
-    <w:bookmarkEnd w:id="41"/>
-    <w:bookmarkStart w:id="45" w:name="X9bb4d92a2ffcf50cf243d3ca918a184936063db"/>
+    <w:bookmarkEnd w:id="57"/>
+    <w:bookmarkEnd w:id="58"/>
+    <w:bookmarkStart w:id="64" w:name="X9bb4d92a2ffcf50cf243d3ca918a184936063db"/>
     <w:p>
       <w:pPr>
         <w:pStyle w:val="Heading1"/>
@@ -8338,7 +9065,7 @@
         <w:t xml:space="preserve">copy: it compiles, passes its own rule checks, and replays its own victory and defeat scripts.</w:t>
       </w:r>
     </w:p>
-    <w:bookmarkStart w:id="42" w:name="commit-history"/>
+    <w:bookmarkStart w:id="61" w:name="commit-history"/>
     <w:p>
       <w:pPr>
         <w:pStyle w:val="Heading2"/>
@@ -8804,76 +9531,31 @@
           </w:p>
         </w:tc>
       </w:tr>
-      <w:tr>
-        <w:tc>
-          <w:tcPr/>
-          <w:p>
-            <w:pPr>
-              <w:pStyle w:val="Compact"/>
-              <w:spacing w:after="20" w:before="20"/>
-            </w:pPr>
-            <w:r>
-              <w:rPr>
-                <w:rStyle w:val="VerbatimChar"/>
-                <w:sz w:val="18"/>
-              </w:rPr>
-              <w:t xml:space="preserve">067d018</w:t>
-            </w:r>
-          </w:p>
-        </w:tc>
-        <w:tc>
-          <w:tcPr/>
-          <w:p>
-            <w:pPr>
-              <w:pStyle w:val="Compact"/>
-              <w:spacing w:after="20" w:before="20"/>
-            </w:pPr>
-            <w:r>
-              <w:rPr>
-                <w:sz w:val="18"/>
-              </w:rPr>
-              <w:t xml:space="preserve">2026-10-08</w:t>
-            </w:r>
-          </w:p>
-        </w:tc>
-        <w:tc>
-          <w:tcPr/>
-          <w:p>
-            <w:pPr>
-              <w:pStyle w:val="Compact"/>
-              <w:spacing w:after="20" w:before="20"/>
-            </w:pPr>
-            <w:r>
-              <w:rPr>
-                <w:sz w:val="18"/>
-              </w:rPr>
-              <w:t xml:space="preserve">Docs: UML class and sequence diagrams, PDF report with build script, README, video script</w:t>
-            </w:r>
-          </w:p>
-        </w:tc>
-        <w:tc>
-          <w:tcPr/>
-          <w:p>
-            <w:pPr>
-              <w:pStyle w:val="Compact"/>
-              <w:spacing w:after="20" w:before="20"/>
-            </w:pPr>
-          </w:p>
-        </w:tc>
-      </w:tr>
     </w:tbl>
     <w:p>
       <w:pPr>
         <w:pStyle w:val="BodyText"/>
       </w:pPr>
       <w:r>
-        <w:t xml:space="preserve">Compare on GitHub: https://github.com/theApolloAlien/restaurant-rush/compare/stage-1...stage-2 and</w:t>
-      </w:r>
-      <w:r>
-        <w:t xml:space="preserve"> </w:t>
-      </w:r>
-      <w:r>
-        <w:t xml:space="preserve">https://github.com/theApolloAlien/restaurant-rush/compare/stage-2...stage-3. Locally:</w:t>
+        <w:t xml:space="preserve">The table runs up to the</w:t>
+      </w:r>
+      <w:r>
+        <w:t xml:space="preserve"> </w:t>
+      </w:r>
+      <w:r>
+        <w:t xml:space="preserve">stage-3</w:t>
+      </w:r>
+      <w:r>
+        <w:t xml:space="preserve"> </w:t>
+      </w:r>
+      <w:r>
+        <w:t xml:space="preserve">tag. Later commits only add the report,</w:t>
+      </w:r>
+      <w:r>
+        <w:t xml:space="preserve"> </w:t>
+      </w:r>
+      <w:r>
+        <w:t xml:space="preserve">diagrams and submission files:</w:t>
       </w:r>
       <w:r>
         <w:t xml:space="preserve"> </w:t>
@@ -8882,14 +9564,72 @@
         <w:rPr>
           <w:rStyle w:val="VerbatimChar"/>
         </w:rPr>
+        <w:t xml:space="preserve">git diff stage-3 main -- src test scripts</w:t>
+      </w:r>
+      <w:r>
+        <w:t xml:space="preserve"> </w:t>
+      </w:r>
+      <w:r>
+        <w:t xml:space="preserve">is empty.</w:t>
+      </w:r>
+      <w:r>
+        <w:t xml:space="preserve"> </w:t>
+      </w:r>
+      <w:r>
+        <w:t xml:space="preserve">Compare on GitHub:</w:t>
+      </w:r>
+      <w:r>
+        <w:t xml:space="preserve"> </w:t>
+      </w:r>
+      <w:hyperlink r:id="rId59">
+        <w:r>
+          <w:rPr>
+            <w:rStyle w:val="Hyperlink"/>
+          </w:rPr>
+          <w:t xml:space="preserve">stage-1...stage-2</w:t>
+        </w:r>
+      </w:hyperlink>
+      <w:r>
+        <w:t xml:space="preserve"> </w:t>
+      </w:r>
+      <w:r>
+        <w:t xml:space="preserve">and</w:t>
+      </w:r>
+      <w:r>
+        <w:t xml:space="preserve"> </w:t>
+      </w:r>
+      <w:hyperlink r:id="rId60">
+        <w:r>
+          <w:rPr>
+            <w:rStyle w:val="Hyperlink"/>
+          </w:rPr>
+          <w:t xml:space="preserve">stage-2...stage-3</w:t>
+        </w:r>
+      </w:hyperlink>
+      <w:r>
+        <w:t xml:space="preserve">.</w:t>
+      </w:r>
+      <w:r>
+        <w:t xml:space="preserve"> </w:t>
+      </w:r>
+      <w:r>
+        <w:t xml:space="preserve">Locally:</w:t>
+      </w:r>
+      <w:r>
+        <w:t xml:space="preserve"> </w:t>
+      </w:r>
+      <w:r>
+        <w:rPr>
+          <w:rStyle w:val="VerbatimChar"/>
+        </w:rPr>
         <w:t xml:space="preserve">git diff stage-1 stage-2 --stat</w:t>
       </w:r>
       <w:r>
         <w:t xml:space="preserve">.</w:t>
       </w:r>
     </w:p>
-    <w:bookmarkEnd w:id="42"/>
-    <w:bookmarkStart w:id="43" w:name="X519295f7728af09d2e1479ca495a4427467ece9"/>
+    <w:bookmarkEnd w:id="61"/>
+    <w:bookmarkStart w:id="62" w:name="X519295f7728af09d2e1479ca495a4427467ece9"/>
     <w:p>
       <w:pPr>
         <w:pStyle w:val="Heading2"/>
@@ -9217,22 +9957,22 @@
               <w:rPr>
                 <w:sz w:val="18"/>
               </w:rPr>
-              <w:t xml:space="preserve">2 lines</w:t>
-            </w:r>
-          </w:p>
-        </w:tc>
-        <w:tc>
-          <w:tcPr/>
-          <w:p>
-            <w:pPr>
-              <w:pStyle w:val="Compact"/>
-              <w:spacing w:after="20" w:before="20"/>
-            </w:pPr>
-            <w:r>
-              <w:rPr>
-                <w:sz w:val="18"/>
-              </w:rPr>
-              <w:t xml:space="preserve">Registration: Ben (turn 4) becomes a Critic and Chloe (turn 7) a VIP. Still six arrivals.</w:t>
+              <w:t xml:space="preserve">small</w:t>
+            </w:r>
+          </w:p>
+        </w:tc>
+        <w:tc>
+          <w:tcPr/>
+          <w:p>
+            <w:pPr>
+              <w:pStyle w:val="Compact"/>
+              <w:spacing w:after="20" w:before="20"/>
+            </w:pPr>
+            <w:r>
+              <w:rPr>
+                <w:sz w:val="18"/>
+              </w:rPr>
+              <w:t xml:space="preserve">Registration (two arrival lines and their imports): Ben (turn 4) becomes a Critic and Chloe (turn 7) a VIP. Still six arrivals.</w:t>
             </w:r>
           </w:p>
         </w:tc>
@@ -9445,8 +10185,8 @@
         </w:tc>
       </w:tr>
     </w:tbl>
-    <w:bookmarkEnd w:id="43"/>
-    <w:bookmarkStart w:id="44" w:name="X913bb8973db6b88e54ecf1d3b4c0ed46065af3f"/>
+    <w:bookmarkEnd w:id="62"/>
+    <w:bookmarkStart w:id="63" w:name="X913bb8973db6b88e54ecf1d3b4c0ed46065af3f"/>
     <w:p>
       <w:pPr>
         <w:pStyle w:val="Heading2"/>
@@ -9823,7 +10563,7 @@
               <w:rPr>
                 <w:sz w:val="18"/>
               </w:rPr>
-              <w:t xml:space="preserve">). The public API is the same, so</w:t>
+              <w:t xml:space="preserve">). Its public methods are the same, so</w:t>
             </w:r>
             <w:r>
               <w:rPr>
@@ -9886,7 +10626,51 @@
               <w:rPr>
                 <w:sz w:val="18"/>
               </w:rPr>
-              <w:t xml:space="preserve">and the Critic did not change.</w:t>
+              <w:t xml:space="preserve">and the Critic did not change. Only the setup in</w:t>
+            </w:r>
+            <w:r>
+              <w:rPr>
+                <w:sz w:val="18"/>
+              </w:rPr>
+              <w:t xml:space="preserve"> </w:t>
+            </w:r>
+            <w:r>
+              <w:rPr>
+                <w:rStyle w:val="VerbatimChar"/>
+                <w:sz w:val="18"/>
+              </w:rPr>
+              <w:t xml:space="preserve">GameConfig</w:t>
+            </w:r>
+            <w:r>
+              <w:rPr>
+                <w:sz w:val="18"/>
+              </w:rPr>
+              <w:t xml:space="preserve"> </w:t>
+            </w:r>
+            <w:r>
+              <w:rPr>
+                <w:sz w:val="18"/>
+              </w:rPr>
+              <w:t xml:space="preserve">now builds</w:t>
+            </w:r>
+            <w:r>
+              <w:rPr>
+                <w:sz w:val="18"/>
+              </w:rPr>
+              <w:t xml:space="preserve"> </w:t>
+            </w:r>
+            <w:r>
+              <w:rPr>
+                <w:rStyle w:val="VerbatimChar"/>
+                <w:sz w:val="18"/>
+              </w:rPr>
+              <w:t xml:space="preserve">Dish</w:t>
+            </w:r>
+            <w:r>
+              <w:rPr>
+                <w:sz w:val="18"/>
+              </w:rPr>
+              <w:t xml:space="preserve">es.</w:t>
             </w:r>
           </w:p>
         </w:tc>
@@ -10430,6 +11214,60 @@
                 <w:rStyle w:val="VerbatimChar"/>
                 <w:sz w:val="18"/>
               </w:rPr>
+              <w:t xml:space="preserve">Main.java</w:t>
+            </w:r>
+            <w:r>
+              <w:rPr>
+                <w:sz w:val="18"/>
+              </w:rPr>
+              <w:t xml:space="preserve">, tests, scripts, docs</w:t>
+            </w:r>
+          </w:p>
+        </w:tc>
+        <w:tc>
+          <w:tcPr/>
+          <w:p>
+            <w:pPr>
+              <w:pStyle w:val="Compact"/>
+              <w:spacing w:after="20" w:before="20"/>
+            </w:pPr>
+            <w:r>
+              <w:rPr>
+                <w:sz w:val="18"/>
+              </w:rPr>
+              <w:t xml:space="preserve">updated</w:t>
+            </w:r>
+          </w:p>
+        </w:tc>
+        <w:tc>
+          <w:tcPr/>
+          <w:p>
+            <w:pPr>
+              <w:pStyle w:val="Compact"/>
+              <w:spacing w:after="20" w:before="20"/>
+            </w:pPr>
+            <w:r>
+              <w:rPr>
+                <w:sz w:val="18"/>
+              </w:rPr>
+              <w:t xml:space="preserve">Edition label, 6 new rule checks (22 in total), Stage 3 scripts and notes.</w:t>
+            </w:r>
+          </w:p>
+        </w:tc>
+      </w:tr>
+      <w:tr>
+        <w:tc>
+          <w:tcPr/>
+          <w:p>
+            <w:pPr>
+              <w:pStyle w:val="Compact"/>
+              <w:spacing w:after="20" w:before="20"/>
+            </w:pPr>
+            <w:r>
+              <w:rPr>
+                <w:rStyle w:val="VerbatimChar"/>
+                <w:sz w:val="18"/>
+              </w:rPr>
               <w:t xml:space="preserve">Waiter</w:t>
             </w:r>
             <w:r>
@@ -10581,9 +11419,9 @@
         <w:t xml:space="preserve">"READY, then SERVED next turn" rule, and they all pass.</w:t>
       </w:r>
     </w:p>
-    <w:bookmarkEnd w:id="44"/>
-    <w:bookmarkEnd w:id="45"/>
-    <w:bookmarkStart w:id="50" w:name="functional-evidence"/>
+    <w:bookmarkEnd w:id="63"/>
+    <w:bookmarkEnd w:id="64"/>
+    <w:bookmarkStart w:id="69" w:name="functional-evidence"/>
     <w:p>
       <w:pPr>
         <w:pStyle w:val="Heading1"/>
@@ -10618,7 +11456,7 @@
         <w:t xml:space="preserve">.</w:t>
       </w:r>
     </w:p>
-    <w:bookmarkStart w:id="49" w:name="X54164bfa93860fa3a2dca3d9369d1cfd36d9476"/>
+    <w:bookmarkStart w:id="68" w:name="X54164bfa93860fa3a2dca3d9369d1cfd36d9476"/>
     <w:p>
       <w:pPr>
         <w:pStyle w:val="Heading2"/>
@@ -10666,20 +11504,20 @@
       <w:r>
         <w:drawing>
           <wp:inline>
-            <wp:extent cx="5334000" cy="5007864"/>
+            <wp:extent cx="5940000" cy="5576811"/>
             <wp:effectExtent b="0" l="0" r="0" t="0"/>
-            <wp:docPr descr="TERM_LAUNCH" title="" id="47" name="Picture"/>
+            <wp:docPr descr="Stage 1: launch, first dashboard and two rejected inputs (turn 1)" title="Stage 1: launch, first dashboard and two rejected inputs (turn 1)" id="66" name="Picture"/>
             <a:graphic>
               <a:graphicData uri="http://schemas.openxmlformats.org/drawingml/2006/picture">
                 <pic:pic>
                   <pic:nvPicPr>
-                    <pic:cNvPr descr="img/TERM_LAUNCH.png" id="48" name="Picture"/>
+                    <pic:cNvPr descr="img/TERM_LAUNCH.png" id="67" name="Picture"/>
                     <pic:cNvPicPr>
                       <a:picLocks noChangeArrowheads="1" noChangeAspect="1"/>
                     </pic:cNvPicPr>
                   </pic:nvPicPr>
                   <pic:blipFill>
-                    <a:blip r:embed="rId46"/>
+                    <a:blip r:embed="rId65"/>
                     <a:stretch>
                       <a:fillRect/>
                     </a:stretch>
@@ -10687,7 +11525,7 @@
                   <pic:spPr bwMode="auto">
                     <a:xfrm>
                       <a:off x="0" y="0"/>
-                      <a:ext cx="5334000" cy="5007864"/>
+                      <a:ext cx="5940000" cy="5576811"/>
                     </a:xfrm>
                     <a:prstGeom prst="rect">
                       <a:avLst/>
@@ -10706,9 +11544,9 @@
         </w:drawing>
       </w:r>
     </w:p>
-    <w:bookmarkEnd w:id="49"/>
-    <w:bookmarkEnd w:id="50"/>
-    <w:bookmarkStart w:id="57" w:name="Xde56d619b26a4c8a4eca94bca3b518335bce121"/>
+    <w:bookmarkEnd w:id="68"/>
+    <w:bookmarkEnd w:id="69"/>
+    <w:bookmarkStart w:id="76" w:name="Xde56d619b26a4c8a4eca94bca3b518335bce121"/>
     <w:p>
       <w:pPr>
         <w:pStyle w:val="Heading2"/>
@@ -10759,20 +11597,20 @@
       <w:r>
         <w:drawing>
           <wp:inline>
-            <wp:extent cx="5334000" cy="2054352"/>
+            <wp:extent cx="5940000" cy="2287748"/>
             <wp:effectExtent b="0" l="0" r="0" t="0"/>
-            <wp:docPr descr="TERM_READY_SERVED" title="" id="52" name="Picture"/>
+            <wp:docPr descr="Stage 1, turn 9: serve rejected (still cooking), then the Chef makes it READY" title="Stage 1, turn 9: serve rejected (still cooking), then the Chef makes it READY" id="71" name="Picture"/>
             <a:graphic>
               <a:graphicData uri="http://schemas.openxmlformats.org/drawingml/2006/picture">
                 <pic:pic>
                   <pic:nvPicPr>
-                    <pic:cNvPr descr="img/TERM_READY_SERVED.png" id="53" name="Picture"/>
+                    <pic:cNvPr descr="img/TERM_READY_SERVED.png" id="72" name="Picture"/>
                     <pic:cNvPicPr>
                       <a:picLocks noChangeArrowheads="1" noChangeAspect="1"/>
                     </pic:cNvPicPr>
                   </pic:nvPicPr>
                   <pic:blipFill>
-                    <a:blip r:embed="rId51"/>
+                    <a:blip r:embed="rId70"/>
                     <a:stretch>
                       <a:fillRect/>
                     </a:stretch>
@@ -10780,7 +11618,7 @@
                   <pic:spPr bwMode="auto">
                     <a:xfrm>
                       <a:off x="0" y="0"/>
-                      <a:ext cx="5334000" cy="2054352"/>
+                      <a:ext cx="5940000" cy="2287748"/>
                     </a:xfrm>
                     <a:prstGeom prst="rect">
                       <a:avLst/>
@@ -10806,20 +11644,20 @@
       <w:r>
         <w:drawing>
           <wp:inline>
-            <wp:extent cx="5334000" cy="4245864"/>
+            <wp:extent cx="5940000" cy="4728240"/>
             <wp:effectExtent b="0" l="0" r="0" t="0"/>
-            <wp:docPr descr="TERM_TRADEOFF" title="" id="55" name="Picture"/>
+            <wp:docPr descr="Stage 1, turn 10: Dev arrives as the Pasta is READY; one Waiter, two needs" title="Stage 1, turn 10: Dev arrives as the Pasta is READY; one Waiter, two needs" id="74" name="Picture"/>
             <a:graphic>
               <a:graphicData uri="http://schemas.openxmlformats.org/drawingml/2006/picture">
                 <pic:pic>
                   <pic:nvPicPr>
-                    <pic:cNvPr descr="img/TERM_TRADEOFF.png" id="56" name="Picture"/>
+                    <pic:cNvPr descr="img/TERM_TRADEOFF.png" id="75" name="Picture"/>
                     <pic:cNvPicPr>
                       <a:picLocks noChangeArrowheads="1" noChangeAspect="1"/>
                     </pic:cNvPicPr>
                   </pic:nvPicPr>
                   <pic:blipFill>
-                    <a:blip r:embed="rId54"/>
+                    <a:blip r:embed="rId73"/>
                     <a:stretch>
                       <a:fillRect/>
                     </a:stretch>
@@ -10827,7 +11665,7 @@
                   <pic:spPr bwMode="auto">
                     <a:xfrm>
                       <a:off x="0" y="0"/>
-                      <a:ext cx="5334000" cy="4245864"/>
+                      <a:ext cx="5940000" cy="4728240"/>
                     </a:xfrm>
                     <a:prstGeom prst="rect">
                       <a:avLst/>
@@ -10846,8 +11684,8 @@
         </w:drawing>
       </w:r>
     </w:p>
-    <w:bookmarkEnd w:id="57"/>
-    <w:bookmarkStart w:id="67" w:name="payment-victory-and-defeat-stage-1"/>
+    <w:bookmarkEnd w:id="76"/>
+    <w:bookmarkStart w:id="86" w:name="payment-victory-and-defeat-stage-1"/>
     <w:p>
       <w:pPr>
         <w:pStyle w:val="Heading2"/>
@@ -10871,20 +11709,20 @@
       <w:r>
         <w:drawing>
           <wp:inline>
-            <wp:extent cx="5334000" cy="1008888"/>
+            <wp:extent cx="5940000" cy="1123508"/>
             <wp:effectExtent b="0" l="0" r="0" t="0"/>
-            <wp:docPr descr="TERM_PAYMENT" title="" id="59" name="Picture"/>
+            <wp:docPr descr="Stage 1: end of turn 12, the Cashier collects Chloe's Pasta" title="Stage 1: end of turn 12, the Cashier collects Chloe's Pasta" id="78" name="Picture"/>
             <a:graphic>
               <a:graphicData uri="http://schemas.openxmlformats.org/drawingml/2006/picture">
                 <pic:pic>
                   <pic:nvPicPr>
-                    <pic:cNvPr descr="img/TERM_PAYMENT.png" id="60" name="Picture"/>
+                    <pic:cNvPr descr="img/TERM_PAYMENT.png" id="79" name="Picture"/>
                     <pic:cNvPicPr>
                       <a:picLocks noChangeArrowheads="1" noChangeAspect="1"/>
                     </pic:cNvPicPr>
                   </pic:nvPicPr>
                   <pic:blipFill>
-                    <a:blip r:embed="rId58"/>
+                    <a:blip r:embed="rId77"/>
                     <a:stretch>
                       <a:fillRect/>
                     </a:stretch>
@@ -10892,7 +11730,7 @@
                   <pic:spPr bwMode="auto">
                     <a:xfrm>
                       <a:off x="0" y="0"/>
-                      <a:ext cx="5334000" cy="1008888"/>
+                      <a:ext cx="5940000" cy="1123508"/>
                     </a:xfrm>
                     <a:prstGeom prst="rect">
                       <a:avLst/>
@@ -10918,20 +11756,20 @@
       <w:r>
         <w:drawing>
           <wp:inline>
-            <wp:extent cx="5334000" cy="2340864"/>
+            <wp:extent cx="5940000" cy="2606811"/>
             <wp:effectExtent b="0" l="0" r="0" t="0"/>
-            <wp:docPr descr="TERM_S1_VICTORY" title="" id="62" name="Picture"/>
+            <wp:docPr descr="Stage 1 victory run: result screen" title="Stage 1 victory run: result screen" id="81" name="Picture"/>
             <a:graphic>
               <a:graphicData uri="http://schemas.openxmlformats.org/drawingml/2006/picture">
                 <pic:pic>
                   <pic:nvPicPr>
-                    <pic:cNvPr descr="img/TERM_S1_VICTORY.png" id="63" name="Picture"/>
+                    <pic:cNvPr descr="img/TERM_S1_VICTORY.png" id="82" name="Picture"/>
                     <pic:cNvPicPr>
                       <a:picLocks noChangeArrowheads="1" noChangeAspect="1"/>
                     </pic:cNvPicPr>
                   </pic:nvPicPr>
                   <pic:blipFill>
-                    <a:blip r:embed="rId61"/>
+                    <a:blip r:embed="rId80"/>
                     <a:stretch>
                       <a:fillRect/>
                     </a:stretch>
@@ -10939,7 +11777,7 @@
                   <pic:spPr bwMode="auto">
                     <a:xfrm>
                       <a:off x="0" y="0"/>
-                      <a:ext cx="5334000" cy="2340864"/>
+                      <a:ext cx="5940000" cy="2606811"/>
                     </a:xfrm>
                     <a:prstGeom prst="rect">
                       <a:avLst/>
@@ -10965,20 +11803,20 @@
       <w:r>
         <w:drawing>
           <wp:inline>
-            <wp:extent cx="5334000" cy="2340864"/>
+            <wp:extent cx="5940000" cy="2606811"/>
             <wp:effectExtent b="0" l="0" r="0" t="0"/>
-            <wp:docPr descr="TERM_S1_DEFEAT" title="" id="65" name="Picture"/>
+            <wp:docPr descr="Stage 1 defeat run: result screen" title="Stage 1 defeat run: result screen" id="84" name="Picture"/>
             <a:graphic>
               <a:graphicData uri="http://schemas.openxmlformats.org/drawingml/2006/picture">
                 <pic:pic>
                   <pic:nvPicPr>
-                    <pic:cNvPr descr="img/TERM_S1_DEFEAT.png" id="66" name="Picture"/>
+                    <pic:cNvPr descr="img/TERM_S1_DEFEAT.png" id="85" name="Picture"/>
                     <pic:cNvPicPr>
                       <a:picLocks noChangeArrowheads="1" noChangeAspect="1"/>
                     </pic:cNvPicPr>
                   </pic:nvPicPr>
                   <pic:blipFill>
-                    <a:blip r:embed="rId64"/>
+                    <a:blip r:embed="rId83"/>
                     <a:stretch>
                       <a:fillRect/>
                     </a:stretch>
@@ -10986,7 +11824,7 @@
                   <pic:spPr bwMode="auto">
                     <a:xfrm>
                       <a:off x="0" y="0"/>
-                      <a:ext cx="5334000" cy="2340864"/>
+                      <a:ext cx="5940000" cy="2606811"/>
                     </a:xfrm>
                     <a:prstGeom prst="rect">
                       <a:avLst/>
@@ -11025,8 +11863,8 @@
         <w:t xml:space="preserve">3 paid, $42.00.</w:t>
       </w:r>
     </w:p>
-    <w:bookmarkEnd w:id="67"/>
-    <w:bookmarkStart w:id="74" w:name="vip-and-critic-behaviour-stage-2"/>
+    <w:bookmarkEnd w:id="86"/>
+    <w:bookmarkStart w:id="93" w:name="vip-and-critic-behaviour-stage-2"/>
     <w:p>
       <w:pPr>
         <w:pStyle w:val="Heading2"/>
@@ -11075,20 +11913,20 @@
       <w:r>
         <w:drawing>
           <wp:inline>
-            <wp:extent cx="5334000" cy="3959352"/>
+            <wp:extent cx="5940000" cy="4409177"/>
             <wp:effectExtent b="0" l="0" r="0" t="0"/>
-            <wp:docPr descr="TERM_CRITIC" title="" id="69" name="Picture"/>
+            <wp:docPr descr="Stage 2, turn 7: the Critic's Pasta is READY just as the VIP arrives" title="Stage 2, turn 7: the Critic's Pasta is READY just as the VIP arrives" id="88" name="Picture"/>
             <a:graphic>
               <a:graphicData uri="http://schemas.openxmlformats.org/drawingml/2006/picture">
                 <pic:pic>
                   <pic:nvPicPr>
-                    <pic:cNvPr descr="img/TERM_CRITIC.png" id="70" name="Picture"/>
+                    <pic:cNvPr descr="img/TERM_CRITIC.png" id="89" name="Picture"/>
                     <pic:cNvPicPr>
                       <a:picLocks noChangeArrowheads="1" noChangeAspect="1"/>
                     </pic:cNvPicPr>
                   </pic:nvPicPr>
                   <pic:blipFill>
-                    <a:blip r:embed="rId68"/>
+                    <a:blip r:embed="rId87"/>
                     <a:stretch>
                       <a:fillRect/>
                     </a:stretch>
@@ -11096,7 +11934,7 @@
                   <pic:spPr bwMode="auto">
                     <a:xfrm>
                       <a:off x="0" y="0"/>
-                      <a:ext cx="5334000" cy="3959352"/>
+                      <a:ext cx="5940000" cy="4409177"/>
                     </a:xfrm>
                     <a:prstGeom prst="rect">
                       <a:avLst/>
@@ -11122,20 +11960,20 @@
       <w:r>
         <w:drawing>
           <wp:inline>
-            <wp:extent cx="5334000" cy="1008888"/>
+            <wp:extent cx="5940000" cy="1123508"/>
             <wp:effectExtent b="0" l="0" r="0" t="0"/>
-            <wp:docPr descr="TERM_REVIEW" title="" id="72" name="Picture"/>
+            <wp:docPr descr="Stage 2, end of turn 9: the Critic pays and posts a review" title="Stage 2, end of turn 9: the Critic pays and posts a review" id="91" name="Picture"/>
             <a:graphic>
               <a:graphicData uri="http://schemas.openxmlformats.org/drawingml/2006/picture">
                 <pic:pic>
                   <pic:nvPicPr>
-                    <pic:cNvPr descr="img/TERM_REVIEW.png" id="73" name="Picture"/>
+                    <pic:cNvPr descr="img/TERM_REVIEW.png" id="92" name="Picture"/>
                     <pic:cNvPicPr>
                       <a:picLocks noChangeArrowheads="1" noChangeAspect="1"/>
                     </pic:cNvPicPr>
                   </pic:nvPicPr>
                   <pic:blipFill>
-                    <a:blip r:embed="rId71"/>
+                    <a:blip r:embed="rId90"/>
                     <a:stretch>
                       <a:fillRect/>
                     </a:stretch>
@@ -11143,7 +11981,7 @@
                   <pic:spPr bwMode="auto">
                     <a:xfrm>
                       <a:off x="0" y="0"/>
-                      <a:ext cx="5334000" cy="1008888"/>
+                      <a:ext cx="5940000" cy="1123508"/>
                     </a:xfrm>
                     <a:prstGeom prst="rect">
                       <a:avLst/>
@@ -11162,8 +12000,8 @@
         </w:drawing>
       </w:r>
     </w:p>
-    <w:bookmarkEnd w:id="74"/>
-    <w:bookmarkStart w:id="81" w:name="X36fa3d678baa2603fd229835d9a24ff6ca60560"/>
+    <w:bookmarkEnd w:id="93"/>
+    <w:bookmarkStart w:id="100" w:name="X36fa3d678baa2603fd229835d9a24ff6ca60560"/>
     <w:p>
       <w:pPr>
         <w:pStyle w:val="Heading2"/>
@@ -11241,20 +12079,20 @@
       <w:r>
         <w:drawing>
           <wp:inline>
-            <wp:extent cx="5334000" cy="5291328"/>
+            <wp:extent cx="5940000" cy="5892480"/>
             <wp:effectExtent b="0" l="0" r="0" t="0"/>
-            <wp:docPr descr="TERM_HAPPY" title="" id="76" name="Picture"/>
+            <wp:docPr descr="Stage 3, turn 7: Happy Hour, the Host seats, the VIP order is $12.96" title="Stage 3, turn 7: Happy Hour, the Host seats, the VIP order is $12.96" id="95" name="Picture"/>
             <a:graphic>
               <a:graphicData uri="http://schemas.openxmlformats.org/drawingml/2006/picture">
                 <pic:pic>
                   <pic:nvPicPr>
-                    <pic:cNvPr descr="img/TERM_HAPPY.png" id="77" name="Picture"/>
+                    <pic:cNvPr descr="img/TERM_HAPPY.png" id="96" name="Picture"/>
                     <pic:cNvPicPr>
                       <a:picLocks noChangeArrowheads="1" noChangeAspect="1"/>
                     </pic:cNvPicPr>
                   </pic:nvPicPr>
                   <pic:blipFill>
-                    <a:blip r:embed="rId75"/>
+                    <a:blip r:embed="rId94"/>
                     <a:stretch>
                       <a:fillRect/>
                     </a:stretch>
@@ -11262,7 +12100,7 @@
                   <pic:spPr bwMode="auto">
                     <a:xfrm>
                       <a:off x="0" y="0"/>
-                      <a:ext cx="5334000" cy="5291328"/>
+                      <a:ext cx="5940000" cy="5892480"/>
                     </a:xfrm>
                     <a:prstGeom prst="rect">
                       <a:avLst/>
@@ -11288,20 +12126,20 @@
       <w:r>
         <w:drawing>
           <wp:inline>
-            <wp:extent cx="5334000" cy="1295400"/>
+            <wp:extent cx="5940000" cy="1442571"/>
             <wp:effectExtent b="0" l="0" r="0" t="0"/>
-            <wp:docPr descr="TERM_HAPPY2" title="" id="79" name="Picture"/>
+            <wp:docPr descr="Stage 3, turn 8: remaining duration and recovery" title="Stage 3, turn 8: remaining duration and recovery" id="98" name="Picture"/>
             <a:graphic>
               <a:graphicData uri="http://schemas.openxmlformats.org/drawingml/2006/picture">
                 <pic:pic>
                   <pic:nvPicPr>
-                    <pic:cNvPr descr="img/TERM_HAPPY2.png" id="80" name="Picture"/>
+                    <pic:cNvPr descr="img/TERM_HAPPY2.png" id="99" name="Picture"/>
                     <pic:cNvPicPr>
                       <a:picLocks noChangeArrowheads="1" noChangeAspect="1"/>
                     </pic:cNvPicPr>
                   </pic:nvPicPr>
                   <pic:blipFill>
-                    <a:blip r:embed="rId78"/>
+                    <a:blip r:embed="rId97"/>
                     <a:stretch>
                       <a:fillRect/>
                     </a:stretch>
@@ -11309,7 +12147,7 @@
                   <pic:spPr bwMode="auto">
                     <a:xfrm>
                       <a:off x="0" y="0"/>
-                      <a:ext cx="5334000" cy="1295400"/>
+                      <a:ext cx="5940000" cy="1442571"/>
                     </a:xfrm>
                     <a:prstGeom prst="rect">
                       <a:avLst/>
@@ -11328,8 +12166,8 @@
         </w:drawing>
       </w:r>
     </w:p>
-    <w:bookmarkEnd w:id="81"/>
-    <w:bookmarkStart w:id="88" w:name="victory-and-defeat-stage-3"/>
+    <w:bookmarkEnd w:id="100"/>
+    <w:bookmarkStart w:id="107" w:name="victory-and-defeat-stage-3"/>
     <w:p>
       <w:pPr>
         <w:pStyle w:val="Heading2"/>
@@ -11345,20 +12183,20 @@
       <w:r>
         <w:drawing>
           <wp:inline>
-            <wp:extent cx="5334000" cy="2340864"/>
+            <wp:extent cx="5940000" cy="2606811"/>
             <wp:effectExtent b="0" l="0" r="0" t="0"/>
-            <wp:docPr descr="TERM_S3_VICTORY" title="" id="83" name="Picture"/>
+            <wp:docPr descr="Stage 3 victory run: result screen" title="Stage 3 victory run: result screen" id="102" name="Picture"/>
             <a:graphic>
               <a:graphicData uri="http://schemas.openxmlformats.org/drawingml/2006/picture">
                 <pic:pic>
                   <pic:nvPicPr>
-                    <pic:cNvPr descr="img/TERM_S3_VICTORY.png" id="84" name="Picture"/>
+                    <pic:cNvPr descr="img/TERM_S3_VICTORY.png" id="103" name="Picture"/>
                     <pic:cNvPicPr>
                       <a:picLocks noChangeArrowheads="1" noChangeAspect="1"/>
                     </pic:cNvPicPr>
                   </pic:nvPicPr>
                   <pic:blipFill>
-                    <a:blip r:embed="rId82"/>
+                    <a:blip r:embed="rId101"/>
                     <a:stretch>
                       <a:fillRect/>
                     </a:stretch>
@@ -11366,7 +12204,7 @@
                   <pic:spPr bwMode="auto">
                     <a:xfrm>
                       <a:off x="0" y="0"/>
-                      <a:ext cx="5334000" cy="2340864"/>
+                      <a:ext cx="5940000" cy="2606811"/>
                     </a:xfrm>
                     <a:prstGeom prst="rect">
                       <a:avLst/>
@@ -11392,20 +12230,20 @@
       <w:r>
         <w:drawing>
           <wp:inline>
-            <wp:extent cx="5334000" cy="2340864"/>
+            <wp:extent cx="5940000" cy="2606811"/>
             <wp:effectExtent b="0" l="0" r="0" t="0"/>
-            <wp:docPr descr="TERM_S3_DEFEAT" title="" id="86" name="Picture"/>
+            <wp:docPr descr="Stage 3 defeat run: result screen" title="Stage 3 defeat run: result screen" id="105" name="Picture"/>
             <a:graphic>
               <a:graphicData uri="http://schemas.openxmlformats.org/drawingml/2006/picture">
                 <pic:pic>
                   <pic:nvPicPr>
-                    <pic:cNvPr descr="img/TERM_S3_DEFEAT.png" id="87" name="Picture"/>
+                    <pic:cNvPr descr="img/TERM_S3_DEFEAT.png" id="106" name="Picture"/>
                     <pic:cNvPicPr>
                       <a:picLocks noChangeArrowheads="1" noChangeAspect="1"/>
                     </pic:cNvPicPr>
                   </pic:nvPicPr>
                   <pic:blipFill>
-                    <a:blip r:embed="rId85"/>
+                    <a:blip r:embed="rId104"/>
                     <a:stretch>
                       <a:fillRect/>
                     </a:stretch>
@@ -11413,7 +12251,7 @@
                   <pic:spPr bwMode="auto">
                     <a:xfrm>
                       <a:off x="0" y="0"/>
-                      <a:ext cx="5334000" cy="2340864"/>
+                      <a:ext cx="5940000" cy="2606811"/>
                     </a:xfrm>
                     <a:prstGeom prst="rect">
                       <a:avLst/>
@@ -11446,8 +12284,8 @@
         <w:t xml:space="preserve">pay: 3 paid, average 57.0.</w:t>
       </w:r>
     </w:p>
-    <w:bookmarkEnd w:id="88"/>
-    <w:bookmarkStart w:id="92" w:name="rule-checks-at-each-tag"/>
+    <w:bookmarkEnd w:id="107"/>
+    <w:bookmarkStart w:id="111" w:name="rule-checks-at-each-tag"/>
     <w:p>
       <w:pPr>
         <w:pStyle w:val="Heading2"/>
@@ -11527,7 +12365,7 @@
         <w:t xml:space="preserve">examples, and replays the scripted runs through the real console.</w:t>
       </w:r>
     </w:p>
-    <w:bookmarkStart w:id="89" w:name="stage-1-1"/>
+    <w:bookmarkStart w:id="108" w:name="stage-1-1"/>
     <w:p>
       <w:pPr>
         <w:pStyle w:val="Heading3"/>
@@ -11808,8 +12646,8 @@
         <w:t xml:space="preserve">12 passed, 0 failed</w:t>
       </w:r>
     </w:p>
-    <w:bookmarkEnd w:id="89"/>
-    <w:bookmarkStart w:id="90" w:name="stage-2"/>
+    <w:bookmarkEnd w:id="108"/>
+    <w:bookmarkStart w:id="109" w:name="stage-2"/>
     <w:p>
       <w:pPr>
         <w:pStyle w:val="Heading3"/>
@@ -12178,8 +13016,8 @@
         <w:t xml:space="preserve">16 passed, 0 failed</w:t>
       </w:r>
     </w:p>
-    <w:bookmarkEnd w:id="90"/>
-    <w:bookmarkStart w:id="91" w:name="stage-3"/>
+    <w:bookmarkEnd w:id="109"/>
+    <w:bookmarkStart w:id="110" w:name="stage-3"/>
     <w:p>
       <w:pPr>
         <w:pStyle w:val="Heading3"/>
@@ -12680,9 +13518,9 @@
         <w:t xml:space="preserve">22 passed, 0 failed</w:t>
       </w:r>
     </w:p>
-    <w:bookmarkEnd w:id="91"/>
-    <w:bookmarkEnd w:id="92"/>
-    <w:bookmarkStart w:id="93" w:name="rule-interpretations"/>
+    <w:bookmarkEnd w:id="110"/>
+    <w:bookmarkEnd w:id="111"/>
+    <w:bookmarkStart w:id="112" w:name="rule-interpretations"/>
     <w:p>
       <w:pPr>
         <w:pStyle w:val="Heading1"/>
@@ -13263,8 +14101,8 @@
         </w:tc>
       </w:tr>
     </w:tbl>
-    <w:bookmarkEnd w:id="93"/>
-    <w:bookmarkStart w:id="97" w:name="reflection-and-contributions"/>
+    <w:bookmarkEnd w:id="112"/>
+    <w:bookmarkStart w:id="116" w:name="reflection-and-contributions"/>
     <w:p>
       <w:pPr>
         <w:pStyle w:val="Heading1"/>
@@ -13273,7 +14111,7 @@
         <w:t xml:space="preserve">9 Reflection and contributions</w:t>
       </w:r>
     </w:p>
-    <w:bookmarkStart w:id="94" w:name="what-worked"/>
+    <w:bookmarkStart w:id="113" w:name="what-worked"/>
     <w:p>
       <w:pPr>
         <w:pStyle w:val="Heading2"/>
@@ -13423,8 +14261,8 @@
         <w:t xml:space="preserve">the marker, the video and the rule checks.</w:t>
       </w:r>
     </w:p>
-    <w:bookmarkEnd w:id="94"/>
-    <w:bookmarkStart w:id="95" w:name="what-we-would-do-differently"/>
+    <w:bookmarkEnd w:id="113"/>
+    <w:bookmarkStart w:id="114" w:name="what-we-would-do-differently"/>
     <w:p>
       <w:pPr>
         <w:pStyle w:val="Heading2"/>
@@ -13517,8 +14355,8 @@
         <w:t xml:space="preserve">best Waiter priority, which we only noticed late.</w:t>
       </w:r>
     </w:p>
-    <w:bookmarkEnd w:id="95"/>
-    <w:bookmarkStart w:id="96" w:name="contributions"/>
+    <w:bookmarkEnd w:id="114"/>
+    <w:bookmarkStart w:id="115" w:name="contributions"/>
     <w:p>
       <w:pPr>
         <w:pStyle w:val="Heading2"/>
@@ -14040,10 +14878,10 @@
         </w:tc>
       </w:tr>
     </w:tbl>
-    <w:bookmarkEnd w:id="96"/>
-    <w:bookmarkEnd w:id="97"/>
+    <w:bookmarkEnd w:id="115"/>
+    <w:bookmarkEnd w:id="116"/>
     <w:sectPr>
-      <w:footerReference w:type="default" r:id="rId13"/>
+      <w:footerReference w:type="default" r:id="rId14"/>
       <w:footnotePr>
         <w:numRestart w:val="eachSect"/>
       </w:footnotePr>

</xml_diff>

<commit_message>
Number the diagram files 01-07 and add a draw.io import guide
- docs/diagrams: 01-class-diagram, then 02-sequence-part-1-... to
  07-sequence-part-6-... (mmd, svg and drawio renamed together)
- submission-folder/editable/diagrams/README.txt says which files to open and
  what each one shows
- prepare_submission.py no longer overwrites an editable .docx or .drawio that
  was changed by hand (it remembers what it wrote in editable/.generated.json)
- Report rebuilt with the new file names
</commit_message>
<xml_diff>
--- a/docs/report/Restaurant-Rush-Report.docx
+++ b/docs/report/Restaurant-Rush-Report.docx
@@ -1766,7 +1766,7 @@
         <w:rPr>
           <w:rStyle w:val="VerbatimChar"/>
         </w:rPr>
-        <w:t xml:space="preserve">docs/diagrams/class-diagram.drawio</w:t>
+        <w:t xml:space="preserve">docs/diagrams/01-class-diagram.drawio</w:t>
       </w:r>
       <w:r>
         <w:t xml:space="preserve">.</w:t>
@@ -3754,7 +3754,7 @@
         <w:rPr>
           <w:rStyle w:val="VerbatimChar"/>
         </w:rPr>
-        <w:t xml:space="preserve">docs/diagrams/sequence-1-arrival-seating.drawio</w:t>
+        <w:t xml:space="preserve">docs/diagrams/02-sequence-part-1-arrival-seating.drawio</w:t>
       </w:r>
     </w:p>
     <w:p>
@@ -3828,7 +3828,7 @@
         <w:rPr>
           <w:rStyle w:val="VerbatimChar"/>
         </w:rPr>
-        <w:t xml:space="preserve">docs/diagrams/sequence-2-order-pricing.drawio</w:t>
+        <w:t xml:space="preserve">docs/diagrams/03-sequence-part-2-order-pricing.drawio</w:t>
       </w:r>
     </w:p>
     <w:p>
@@ -3902,7 +3902,7 @@
         <w:rPr>
           <w:rStyle w:val="VerbatimChar"/>
         </w:rPr>
-        <w:t xml:space="preserve">docs/diagrams/sequence-3-ready.drawio</w:t>
+        <w:t xml:space="preserve">docs/diagrams/04-sequence-part-3-ready.drawio</w:t>
       </w:r>
     </w:p>
     <w:p>
@@ -3976,7 +3976,7 @@
         <w:rPr>
           <w:rStyle w:val="VerbatimChar"/>
         </w:rPr>
-        <w:t xml:space="preserve">docs/diagrams/sequence-4-served.drawio</w:t>
+        <w:t xml:space="preserve">docs/diagrams/05-sequence-part-4-served.drawio</w:t>
       </w:r>
     </w:p>
     <w:p>
@@ -4050,7 +4050,7 @@
         <w:rPr>
           <w:rStyle w:val="VerbatimChar"/>
         </w:rPr>
-        <w:t xml:space="preserve">docs/diagrams/sequence-5-eating-payment.drawio</w:t>
+        <w:t xml:space="preserve">docs/diagrams/06-sequence-part-5-eating-payment.drawio</w:t>
       </w:r>
     </w:p>
     <w:p>
@@ -4124,7 +4124,7 @@
         <w:rPr>
           <w:rStyle w:val="VerbatimChar"/>
         </w:rPr>
-        <w:t xml:space="preserve">docs/diagrams/sequence-6-result.drawio</w:t>
+        <w:t xml:space="preserve">docs/diagrams/07-sequence-part-6-result.drawio</w:t>
       </w:r>
     </w:p>
     <w:p>

</xml_diff>